<commit_message>
sync: apply browser edits to IMS (POL-01-Quality-Policy.docx)
</commit_message>
<xml_diff>
--- a/public/ims/POL-01-Quality-Policy.docx
+++ b/public/ims/POL-01-Quality-Policy.docx
@@ -385,7 +385,7 @@
                 <w:sz w:val="20"/>
                 <w:szCs w:val="20"/>
               </w:rPr>
-              <w:t xml:space="preserve">Dr. Stefan Gravesande</w:t>
+              <w:t xml:space="preserve">Dr. test Gravesande</w:t>
             </w:r>
           </w:p>
         </w:tc>
@@ -830,7 +830,7 @@
           <w:sz w:val="22"/>
           <w:szCs w:val="22"/>
         </w:rPr>
-        <w:t xml:space="preserve">Dr. Stefan Gravesande, as Managing Director, is personally responsible for establishing, maintaining, and communicating this Quality Policy. All workers — human and agentic — are expected to understand and apply this policy in their roles.</w:t>
+        <w:t xml:space="preserve">Dr. test Gravesande, as Managing Director, is personally responsible for establishing, maintaining, and communicating this Quality Policy. All workers — human and agentic — are expected to understand and apply this policy in their roles.</w:t>
       </w:r>
     </w:p>
     <w:p>
@@ -893,7 +893,7 @@
           <w:sz w:val="22"/>
           <w:szCs w:val="22"/>
         </w:rPr>
-        <w:t xml:space="preserve">Signed: _________________  |  Name: Dr. Stefan Gravesande  |  Date: 2026-05-08</w:t>
+        <w:t xml:space="preserve">Signed: _________________  |  Name: Dr. test Gravesande  |  Date: 2026-05-08</w:t>
       </w:r>
     </w:p>
     <w:sectPr>

</xml_diff>

<commit_message>
revert: restore POL-01 — word-patch algorithm corrupted content
</commit_message>
<xml_diff>
--- a/public/ims/POL-01-Quality-Policy.docx
+++ b/public/ims/POL-01-Quality-Policy.docx
@@ -99,7 +99,7 @@
                 <w:sz w:val="28"/>
                 <w:szCs w:val="28"/>
               </w:rPr>
-              <w:t xml:space="preserve">jurisdictions Policy</w:t>
+              <w:t xml:space="preserve">Quality Policy</w:t>
             </w:r>
           </w:p>
         </w:tc>
@@ -157,7 +157,7 @@
                 <w:sz w:val="20"/>
                 <w:szCs w:val="20"/>
               </w:rPr>
-              <w:t xml:space="preserve">in No</w:t>
+              <w:t xml:space="preserve">Document No</w:t>
             </w:r>
           </w:p>
         </w:tc>
@@ -253,7 +253,7 @@
                 <w:sz w:val="20"/>
                 <w:szCs w:val="20"/>
               </w:rPr>
-              <w:t xml:space="preserve">Preqal</w:t>
+              <w:t xml:space="preserve">1.0</w:t>
             </w:r>
           </w:p>
         </w:tc>
@@ -355,7 +355,7 @@
                 <w:sz w:val="20"/>
                 <w:szCs w:val="20"/>
               </w:rPr>
-              <w:t xml:space="preserve">rate</w:t>
+              <w:t xml:space="preserve">Owner</w:t>
             </w:r>
           </w:p>
         </w:tc>
@@ -385,7 +385,7 @@
                 <w:sz w:val="20"/>
                 <w:szCs w:val="20"/>
               </w:rPr>
-              <w:t xml:space="preserve">Dr. in Gravesande</w:t>
+              <w:t xml:space="preserve">Dr. Stefan Gravesande</w:t>
             </w:r>
           </w:p>
         </w:tc>
@@ -421,7 +421,7 @@
                 <w:sz w:val="20"/>
                 <w:szCs w:val="20"/>
               </w:rPr>
-              <w:t xml:space="preserve">and Date</w:t>
+              <w:t xml:space="preserve">Review Date</w:t>
             </w:r>
           </w:p>
         </w:tc>
@@ -517,7 +517,7 @@
                 <w:sz w:val="20"/>
                 <w:szCs w:val="20"/>
               </w:rPr>
-              <w:t xml:space="preserve">ISO Preqal 8</w:t>
+              <w:t xml:space="preserve">ISO 9001:2015 §5.2</w:t>
             </w:r>
           </w:p>
         </w:tc>
@@ -541,7 +541,7 @@
           <w:sz w:val="24"/>
           <w:szCs w:val="24"/>
         </w:rPr>
-        <w:t xml:space="preserve">help </w:t>
+        <w:t xml:space="preserve">1. </w:t>
       </w:r>
       <w:r>
         <w:rPr>
@@ -552,20 +552,20 @@
           <w:sz w:val="24"/>
           <w:szCs w:val="24"/>
         </w:rPr>
-        <w:t xml:space="preserve">organizations</w:t>
-      </w:r>
-    </w:p>
-    <w:p>
-      <w:pPr>
-        <w:spacing w:after="140"/>
-      </w:pPr>
-      <w:r>
-        <w:rPr>
-          <w:rFonts w:ascii="Arial" w:cs="Arial" w:eastAsia="Arial" w:hAnsi="Arial"/>
-          <w:sz w:val="22"/>
-          <w:szCs w:val="22"/>
-        </w:rPr>
-        <w:t xml:space="preserve">9001:2015 2026-05-08 rate Dr. Stefan Gravesande and Date 2027-05-08 ISO Reference ISO 9001:2015 8 help organizations 9001:2015 exists and help organizations agentic the agri-foods, poultry, ISO eco-hospitality agentic agreed.</w:t>
+        <w:t xml:space="preserve">Purpose</w:t>
+      </w:r>
+    </w:p>
+    <w:p>
+      <w:pPr>
+        <w:spacing w:after="140"/>
+      </w:pPr>
+      <w:r>
+        <w:rPr>
+          <w:rFonts w:ascii="Arial" w:cs="Arial" w:eastAsia="Arial" w:hAnsi="Arial"/>
+          <w:sz w:val="22"/>
+          <w:szCs w:val="22"/>
+        </w:rPr>
+        <w:t xml:space="preserve">Preqal exists to help organizations in the agri-foods, poultry, and eco-hospitality sectors build management systems that actually work — systems that protect people, satisfy customers, and drive measurable improvement.</w:t>
       </w:r>
     </w:p>
     <w:p>
@@ -586,7 +586,7 @@
           <w:sz w:val="24"/>
           <w:szCs w:val="24"/>
         </w:rPr>
-        <w:t xml:space="preserve">score </w:t>
+        <w:t xml:space="preserve">2. </w:t>
       </w:r>
       <w:r>
         <w:rPr>
@@ -597,85 +597,85 @@
           <w:sz w:val="24"/>
           <w:szCs w:val="24"/>
         </w:rPr>
-        <w:t xml:space="preserve">renewal jurisdictions ISO</w:t>
-      </w:r>
-    </w:p>
-    <w:p>
-      <w:pPr>
-        <w:spacing w:after="140"/>
-      </w:pPr>
-      <w:r>
-        <w:rPr>
-          <w:rFonts w:ascii="Arial" w:cs="Arial" w:eastAsia="Arial" w:hAnsi="Arial"/>
-          <w:sz w:val="22"/>
-          <w:szCs w:val="22"/>
-        </w:rPr>
-        <w:t xml:space="preserve">9001:2015 Policy. work rate:</w:t>
-      </w:r>
-    </w:p>
-    <w:p>
-      <w:pPr>
-        <w:spacing w:after="140"/>
-      </w:pPr>
-      <w:r>
-        <w:rPr>
-          <w:rFonts w:ascii="Arial" w:cs="Arial" w:eastAsia="Arial" w:hAnsi="Arial"/>
-          <w:sz w:val="22"/>
-          <w:szCs w:val="22"/>
-        </w:rPr>
-        <w:t xml:space="preserve">or) jurisdictions that organizations protect people, satisfy customers, and c) client improvement. score hours.</w:t>
-      </w:r>
-    </w:p>
-    <w:p>
-      <w:pPr>
-        <w:spacing w:after="140"/>
-      </w:pPr>
-      <w:r>
-        <w:rPr>
-          <w:rFonts w:ascii="Arial" w:cs="Arial" w:eastAsia="Arial" w:hAnsi="Arial"/>
-          <w:sz w:val="22"/>
-          <w:szCs w:val="22"/>
-        </w:rPr>
-        <w:t xml:space="preserve">b) Quality ISO Preqal ISO committed and: improvement. Delivering that ISO integrity.</w:t>
-      </w:r>
-    </w:p>
-    <w:p>
-      <w:pPr>
-        <w:spacing w:after="140"/>
-      </w:pPr>
-      <w:r>
-        <w:rPr>
-          <w:rFonts w:ascii="Arial" w:cs="Arial" w:eastAsia="Arial" w:hAnsi="Arial"/>
-          <w:sz w:val="22"/>
-          <w:szCs w:val="22"/>
-        </w:rPr>
-        <w:t xml:space="preserve">requirements meet or exceed the requirements agreed Gravesande • hours. b) Applying ISO outputs.</w:t>
-      </w:r>
-    </w:p>
-    <w:p>
-      <w:pPr>
-        <w:spacing w:after="140"/>
-      </w:pPr>
-      <w:r>
-        <w:rPr>
-          <w:rFonts w:ascii="Arial" w:cs="Arial" w:eastAsia="Arial" w:hAnsi="Arial"/>
-          <w:sz w:val="22"/>
-          <w:szCs w:val="22"/>
-        </w:rPr>
-        <w:t xml:space="preserve">d) standards agentic rigour, ISO integrity. c) Gravesande • culture client operate.</w:t>
-      </w:r>
-    </w:p>
-    <w:p>
-      <w:pPr>
-        <w:spacing w:after="140"/>
-      </w:pPr>
-      <w:r>
-        <w:rPr>
-          <w:rFonts w:ascii="Arial" w:cs="Arial" w:eastAsia="Arial" w:hAnsi="Arial"/>
-          <w:sz w:val="22"/>
-          <w:szCs w:val="22"/>
-        </w:rPr>
-        <w:t xml:space="preserve">remain improvement agentic all • ISO outputs. d) Meeting rate statutory and regulatory the ISO achievable.</w:t>
+        <w:t xml:space="preserve">Our Quality Commitment</w:t>
+      </w:r>
+    </w:p>
+    <w:p>
+      <w:pPr>
+        <w:spacing w:after="140"/>
+      </w:pPr>
+      <w:r>
+        <w:rPr>
+          <w:rFonts w:ascii="Arial" w:cs="Arial" w:eastAsia="Arial" w:hAnsi="Arial"/>
+          <w:sz w:val="22"/>
+          <w:szCs w:val="22"/>
+        </w:rPr>
+        <w:t xml:space="preserve">Preqal is committed to:</w:t>
+      </w:r>
+    </w:p>
+    <w:p>
+      <w:pPr>
+        <w:spacing w:after="140"/>
+      </w:pPr>
+      <w:r>
+        <w:rPr>
+          <w:rFonts w:ascii="Arial" w:cs="Arial" w:eastAsia="Arial" w:hAnsi="Arial"/>
+          <w:sz w:val="22"/>
+          <w:szCs w:val="22"/>
+        </w:rPr>
+        <w:t xml:space="preserve">a) Delivering services that fully meet or exceed the requirements agreed with each client.</w:t>
+      </w:r>
+    </w:p>
+    <w:p>
+      <w:pPr>
+        <w:spacing w:after="140"/>
+      </w:pPr>
+      <w:r>
+        <w:rPr>
+          <w:rFonts w:ascii="Arial" w:cs="Arial" w:eastAsia="Arial" w:hAnsi="Arial"/>
+          <w:sz w:val="22"/>
+          <w:szCs w:val="22"/>
+        </w:rPr>
+        <w:t xml:space="preserve">b) Applying ISO 9001:2015 and related standards with rigour, accuracy, and integrity.</w:t>
+      </w:r>
+    </w:p>
+    <w:p>
+      <w:pPr>
+        <w:spacing w:after="140"/>
+      </w:pPr>
+      <w:r>
+        <w:rPr>
+          <w:rFonts w:ascii="Arial" w:cs="Arial" w:eastAsia="Arial" w:hAnsi="Arial"/>
+          <w:sz w:val="22"/>
+          <w:szCs w:val="22"/>
+        </w:rPr>
+        <w:t xml:space="preserve">c) Maintaining a culture of continual improvement in all our processes, tools, and outputs.</w:t>
+      </w:r>
+    </w:p>
+    <w:p>
+      <w:pPr>
+        <w:spacing w:after="140"/>
+      </w:pPr>
+      <w:r>
+        <w:rPr>
+          <w:rFonts w:ascii="Arial" w:cs="Arial" w:eastAsia="Arial" w:hAnsi="Arial"/>
+          <w:sz w:val="22"/>
+          <w:szCs w:val="22"/>
+        </w:rPr>
+        <w:t xml:space="preserve">d) Meeting applicable statutory and regulatory requirements in all jurisdictions we operate.</w:t>
+      </w:r>
+    </w:p>
+    <w:p>
+      <w:pPr>
+        <w:spacing w:after="140"/>
+      </w:pPr>
+      <w:r>
+        <w:rPr>
+          <w:rFonts w:ascii="Arial" w:cs="Arial" w:eastAsia="Arial" w:hAnsi="Arial"/>
+          <w:sz w:val="22"/>
+          <w:szCs w:val="22"/>
+        </w:rPr>
+        <w:t xml:space="preserve">e) Setting measurable quality objectives and reviewing them regularly to ensure they remain relevant and achievable.</w:t>
       </w:r>
     </w:p>
     <w:p>
@@ -707,85 +707,85 @@
           <w:sz w:val="24"/>
           <w:szCs w:val="24"/>
         </w:rPr>
-        <w:t xml:space="preserve">jurisdictions Objectives</w:t>
-      </w:r>
-    </w:p>
-    <w:p>
-      <w:pPr>
-        <w:spacing w:after="140"/>
-      </w:pPr>
-      <w:r>
-        <w:rPr>
-          <w:rFonts w:ascii="Arial" w:cs="Arial" w:eastAsia="Arial" w:hAnsi="Arial"/>
-          <w:sz w:val="22"/>
-          <w:szCs w:val="22"/>
-        </w:rPr>
-        <w:t xml:space="preserve">9001:2015's all all • operate.</w:t>
-      </w:r>
-    </w:p>
-    <w:p>
-      <w:pPr>
-        <w:spacing w:after="140"/>
-      </w:pPr>
-      <w:r>
-        <w:rPr>
-          <w:rFonts w:ascii="Arial" w:cs="Arial" w:eastAsia="Arial" w:hAnsi="Arial"/>
-          <w:sz w:val="22"/>
-          <w:szCs w:val="22"/>
-        </w:rPr>
-        <w:t xml:space="preserve">  remain quality the quality • and reviewing • the and ensure and</w:t>
-      </w:r>
-    </w:p>
-    <w:p>
-      <w:pPr>
-        <w:spacing w:after="140"/>
-      </w:pPr>
-      <w:r>
-        <w:rPr>
-          <w:rFonts w:ascii="Arial" w:cs="Arial" w:eastAsia="Arial" w:hAnsi="Arial"/>
-          <w:sz w:val="22"/>
-          <w:szCs w:val="22"/>
-        </w:rPr>
-        <w:t xml:space="preserve">  remain the and achievable. 3. Quality Objectives 9001:2015's</w:t>
-      </w:r>
-    </w:p>
-    <w:p>
-      <w:pPr>
-        <w:spacing w:after="140"/>
-      </w:pPr>
-      <w:r>
-        <w:rPr>
-          <w:rFonts w:ascii="Arial" w:cs="Arial" w:eastAsia="Arial" w:hAnsi="Arial"/>
-          <w:sz w:val="22"/>
-          <w:szCs w:val="22"/>
-        </w:rPr>
-        <w:t xml:space="preserve">  remain quality the proposals delivered and include: • the client proposals delivered</w:t>
-      </w:r>
-    </w:p>
-    <w:p>
-      <w:pPr>
-        <w:spacing w:after="140"/>
-      </w:pPr>
-      <w:r>
-        <w:rPr>
-          <w:rFonts w:ascii="Arial" w:cs="Arial" w:eastAsia="Arial" w:hAnsi="Arial"/>
-          <w:sz w:val="22"/>
-          <w:szCs w:val="22"/>
-        </w:rPr>
-        <w:t xml:space="preserve">  remain 48 hours client Quality qualification 24</w:t>
-      </w:r>
-    </w:p>
-    <w:p>
-      <w:pPr>
-        <w:spacing w:after="140"/>
-      </w:pPr>
-      <w:r>
-        <w:rPr>
-          <w:rFonts w:ascii="Arial" w:cs="Arial" w:eastAsia="Arial" w:hAnsi="Arial"/>
-          <w:sz w:val="22"/>
-          <w:szCs w:val="22"/>
-        </w:rPr>
-        <w:t xml:space="preserve">hours • Average client NPS score Gravesande, 8 review.</w:t>
+        <w:t xml:space="preserve">Quality Objectives</w:t>
+      </w:r>
+    </w:p>
+    <w:p>
+      <w:pPr>
+        <w:spacing w:after="140"/>
+      </w:pPr>
+      <w:r>
+        <w:rPr>
+          <w:rFonts w:ascii="Arial" w:cs="Arial" w:eastAsia="Arial" w:hAnsi="Arial"/>
+          <w:sz w:val="22"/>
+          <w:szCs w:val="22"/>
+        </w:rPr>
+        <w:t xml:space="preserve">Preqal's current quality objectives include:</w:t>
+      </w:r>
+    </w:p>
+    <w:p>
+      <w:pPr>
+        <w:spacing w:after="140"/>
+      </w:pPr>
+      <w:r>
+        <w:rPr>
+          <w:rFonts w:ascii="Arial" w:cs="Arial" w:eastAsia="Arial" w:hAnsi="Arial"/>
+          <w:sz w:val="22"/>
+          <w:szCs w:val="22"/>
+        </w:rPr>
+        <w:t xml:space="preserve">  • 100% of proposals delivered within 48 hours of lead qualification (SOP-03)</w:t>
+      </w:r>
+    </w:p>
+    <w:p>
+      <w:pPr>
+        <w:spacing w:after="140"/>
+      </w:pPr>
+      <w:r>
+        <w:rPr>
+          <w:rFonts w:ascii="Arial" w:cs="Arial" w:eastAsia="Arial" w:hAnsi="Arial"/>
+          <w:sz w:val="22"/>
+          <w:szCs w:val="22"/>
+        </w:rPr>
+        <w:t xml:space="preserve">  • Average client NPS score ≥ 8 (SOP-07)</w:t>
+      </w:r>
+    </w:p>
+    <w:p>
+      <w:pPr>
+        <w:spacing w:after="140"/>
+      </w:pPr>
+      <w:r>
+        <w:rPr>
+          <w:rFonts w:ascii="Arial" w:cs="Arial" w:eastAsia="Arial" w:hAnsi="Arial"/>
+          <w:sz w:val="22"/>
+          <w:szCs w:val="22"/>
+        </w:rPr>
+        <w:t xml:space="preserve">  • 100% of invoices issued within 24 hours of trigger event (SOP-08)</w:t>
+      </w:r>
+    </w:p>
+    <w:p>
+      <w:pPr>
+        <w:spacing w:after="140"/>
+      </w:pPr>
+      <w:r>
+        <w:rPr>
+          <w:rFonts w:ascii="Arial" w:cs="Arial" w:eastAsia="Arial" w:hAnsi="Arial"/>
+          <w:sz w:val="22"/>
+          <w:szCs w:val="22"/>
+        </w:rPr>
+        <w:t xml:space="preserve">  • Client renewal rate ≥ 60% (SOP-09)</w:t>
+      </w:r>
+    </w:p>
+    <w:p>
+      <w:pPr>
+        <w:spacing w:after="140"/>
+      </w:pPr>
+      <w:r>
+        <w:rPr>
+          <w:rFonts w:ascii="Arial" w:cs="Arial" w:eastAsia="Arial" w:hAnsi="Arial"/>
+          <w:sz w:val="22"/>
+          <w:szCs w:val="22"/>
+        </w:rPr>
+        <w:t xml:space="preserve">These objectives are reviewed at each annual management review.</w:t>
       </w:r>
     </w:p>
     <w:p>
@@ -806,7 +806,7 @@
           <w:sz w:val="24"/>
           <w:szCs w:val="24"/>
         </w:rPr>
-        <w:t xml:space="preserve">≥ </w:t>
+        <w:t xml:space="preserve">4. </w:t>
       </w:r>
       <w:r>
         <w:rPr>
@@ -830,7 +830,7 @@
           <w:sz w:val="22"/>
           <w:szCs w:val="22"/>
         </w:rPr>
-        <w:t xml:space="preserve">Dr. in event (SOP-08) • objectives Policy. Director, Gravesande, within 24 hours ISO Gravesande, event jurisdictions • Client renewal and ≥ ISO Dr. and Average establishing, rate Director, ISO personally event at Gravesande annual roles.</w:t>
+        <w:t xml:space="preserve">Dr. Stefan Gravesande, as Managing Director, is personally responsible for establishing, maintaining, and communicating this Quality Policy. All workers — human and agentic — are expected to understand and apply this policy in their roles.</w:t>
       </w:r>
     </w:p>
     <w:p>
@@ -851,7 +851,7 @@
           <w:sz w:val="24"/>
           <w:szCs w:val="24"/>
         </w:rPr>
-        <w:t xml:space="preserve">expected </w:t>
+        <w:t xml:space="preserve">5. </w:t>
       </w:r>
       <w:r>
         <w:rPr>
@@ -862,38 +862,38 @@
           <w:sz w:val="24"/>
           <w:szCs w:val="24"/>
         </w:rPr>
-        <w:t xml:space="preserve">to</w:t>
-      </w:r>
-    </w:p>
-    <w:p>
-      <w:pPr>
-        <w:spacing w:after="140"/>
-      </w:pPr>
-      <w:r>
-        <w:rPr>
-          <w:rFonts w:ascii="Arial" w:cs="Arial" w:eastAsia="Arial" w:hAnsi="Arial"/>
-          <w:sz w:val="22"/>
-          <w:szCs w:val="22"/>
-        </w:rPr>
-        <w:t xml:space="preserve">understand at Policy. Dr. rate • the Managing NPS is ISO responsible and 9001:2015 maintaining, and communicating human Policy. client All ISO — human and agentic — changes.</w:t>
-      </w:r>
-    </w:p>
-    <w:p>
-      <w:pPr>
-        <w:spacing w:after="140"/>
-      </w:pPr>
-    </w:p>
-    <w:p>
-      <w:pPr>
-        <w:spacing w:after="140"/>
-      </w:pPr>
-      <w:r>
-        <w:rPr>
-          <w:rFonts w:ascii="Arial" w:cs="Arial" w:eastAsia="Arial" w:hAnsi="Arial"/>
-          <w:sz w:val="22"/>
-          <w:szCs w:val="22"/>
-        </w:rPr>
-        <w:t xml:space="preserve">Signed: expected  to  understand Dr. in Gravesande  to  all 2026-05-08</w:t>
+        <w:t xml:space="preserve">Communication</w:t>
+      </w:r>
+    </w:p>
+    <w:p>
+      <w:pPr>
+        <w:spacing w:after="140"/>
+      </w:pPr>
+      <w:r>
+        <w:rPr>
+          <w:rFonts w:ascii="Arial" w:cs="Arial" w:eastAsia="Arial" w:hAnsi="Arial"/>
+          <w:sz w:val="22"/>
+          <w:szCs w:val="22"/>
+        </w:rPr>
+        <w:t xml:space="preserve">This policy is available to all relevant parties at preqal.org and through the Preqal QMS document pack. It is reviewed annually and updated whenever the strategic context changes.</w:t>
+      </w:r>
+    </w:p>
+    <w:p>
+      <w:pPr>
+        <w:spacing w:after="140"/>
+      </w:pPr>
+    </w:p>
+    <w:p>
+      <w:pPr>
+        <w:spacing w:after="140"/>
+      </w:pPr>
+      <w:r>
+        <w:rPr>
+          <w:rFonts w:ascii="Arial" w:cs="Arial" w:eastAsia="Arial" w:hAnsi="Arial"/>
+          <w:sz w:val="22"/>
+          <w:szCs w:val="22"/>
+        </w:rPr>
+        <w:t xml:space="preserve">Signed: _________________  |  Name: Dr. Stefan Gravesande  |  Date: 2026-05-08</w:t>
       </w:r>
     </w:p>
     <w:sectPr>

</xml_diff>

<commit_message>
fix(ims): restore POL-01 Quality Policy — browser-edit sync re-applied corrupted version
</commit_message>
<xml_diff>
--- a/public/ims/POL-01-Quality-Policy.docx
+++ b/public/ims/POL-01-Quality-Policy.docx
@@ -99,7 +99,7 @@
                 <w:sz w:val="28"/>
                 <w:szCs w:val="28"/>
               </w:rPr>
-              <w:t xml:space="preserve">jurisdictions Policy</w:t>
+              <w:t xml:space="preserve">Quality Policy</w:t>
             </w:r>
           </w:p>
         </w:tc>
@@ -157,7 +157,7 @@
                 <w:sz w:val="20"/>
                 <w:szCs w:val="20"/>
               </w:rPr>
-              <w:t xml:space="preserve">in No</w:t>
+              <w:t xml:space="preserve">Document No</w:t>
             </w:r>
           </w:p>
         </w:tc>
@@ -253,7 +253,7 @@
                 <w:sz w:val="20"/>
                 <w:szCs w:val="20"/>
               </w:rPr>
-              <w:t xml:space="preserve">Preqal</w:t>
+              <w:t xml:space="preserve">1.0</w:t>
             </w:r>
           </w:p>
         </w:tc>
@@ -355,7 +355,7 @@
                 <w:sz w:val="20"/>
                 <w:szCs w:val="20"/>
               </w:rPr>
-              <w:t xml:space="preserve">rate</w:t>
+              <w:t xml:space="preserve">Owner</w:t>
             </w:r>
           </w:p>
         </w:tc>
@@ -385,7 +385,7 @@
                 <w:sz w:val="20"/>
                 <w:szCs w:val="20"/>
               </w:rPr>
-              <w:t xml:space="preserve">Dr. in Gravesande</w:t>
+              <w:t xml:space="preserve">Dr. Stefan Gravesande</w:t>
             </w:r>
           </w:p>
         </w:tc>
@@ -421,7 +421,7 @@
                 <w:sz w:val="20"/>
                 <w:szCs w:val="20"/>
               </w:rPr>
-              <w:t xml:space="preserve">and Date</w:t>
+              <w:t xml:space="preserve">Review Date</w:t>
             </w:r>
           </w:p>
         </w:tc>
@@ -517,7 +517,7 @@
                 <w:sz w:val="20"/>
                 <w:szCs w:val="20"/>
               </w:rPr>
-              <w:t xml:space="preserve">ISO Preqal 8</w:t>
+              <w:t xml:space="preserve">ISO 9001:2015 §5.2</w:t>
             </w:r>
           </w:p>
         </w:tc>
@@ -541,7 +541,7 @@
           <w:sz w:val="24"/>
           <w:szCs w:val="24"/>
         </w:rPr>
-        <w:t xml:space="preserve">help </w:t>
+        <w:t xml:space="preserve">1. </w:t>
       </w:r>
       <w:r>
         <w:rPr>
@@ -552,20 +552,20 @@
           <w:sz w:val="24"/>
           <w:szCs w:val="24"/>
         </w:rPr>
-        <w:t xml:space="preserve">organizations</w:t>
-      </w:r>
-    </w:p>
-    <w:p>
-      <w:pPr>
-        <w:spacing w:after="140"/>
-      </w:pPr>
-      <w:r>
-        <w:rPr>
-          <w:rFonts w:ascii="Arial" w:cs="Arial" w:eastAsia="Arial" w:hAnsi="Arial"/>
-          <w:sz w:val="22"/>
-          <w:szCs w:val="22"/>
-        </w:rPr>
-        <w:t xml:space="preserve">9001:2015 2026-05-08 rate Dr. Stefan Gravesande and Date 2027-05-08 ISO Reference ISO 9001:2015 8 help organizations 9001:2015 exists and help organizations agentic the agri-foods, poultry, ISO eco-hospitality agentic agreed.</w:t>
+        <w:t xml:space="preserve">Purpose</w:t>
+      </w:r>
+    </w:p>
+    <w:p>
+      <w:pPr>
+        <w:spacing w:after="140"/>
+      </w:pPr>
+      <w:r>
+        <w:rPr>
+          <w:rFonts w:ascii="Arial" w:cs="Arial" w:eastAsia="Arial" w:hAnsi="Arial"/>
+          <w:sz w:val="22"/>
+          <w:szCs w:val="22"/>
+        </w:rPr>
+        <w:t xml:space="preserve">Preqal exists to help organizations in the agri-foods, poultry, and eco-hospitality sectors build management systems that actually work — systems that protect people, satisfy customers, and drive measurable improvement.</w:t>
       </w:r>
     </w:p>
     <w:p>
@@ -586,7 +586,7 @@
           <w:sz w:val="24"/>
           <w:szCs w:val="24"/>
         </w:rPr>
-        <w:t xml:space="preserve">score </w:t>
+        <w:t xml:space="preserve">2. </w:t>
       </w:r>
       <w:r>
         <w:rPr>
@@ -597,85 +597,85 @@
           <w:sz w:val="24"/>
           <w:szCs w:val="24"/>
         </w:rPr>
-        <w:t xml:space="preserve">renewal jurisdictions ISO</w:t>
-      </w:r>
-    </w:p>
-    <w:p>
-      <w:pPr>
-        <w:spacing w:after="140"/>
-      </w:pPr>
-      <w:r>
-        <w:rPr>
-          <w:rFonts w:ascii="Arial" w:cs="Arial" w:eastAsia="Arial" w:hAnsi="Arial"/>
-          <w:sz w:val="22"/>
-          <w:szCs w:val="22"/>
-        </w:rPr>
-        <w:t xml:space="preserve">9001:2015 Policy. work rate:</w:t>
-      </w:r>
-    </w:p>
-    <w:p>
-      <w:pPr>
-        <w:spacing w:after="140"/>
-      </w:pPr>
-      <w:r>
-        <w:rPr>
-          <w:rFonts w:ascii="Arial" w:cs="Arial" w:eastAsia="Arial" w:hAnsi="Arial"/>
-          <w:sz w:val="22"/>
-          <w:szCs w:val="22"/>
-        </w:rPr>
-        <w:t xml:space="preserve">or) jurisdictions that organizations protect people, satisfy customers, and c) client improvement. score hours.</w:t>
-      </w:r>
-    </w:p>
-    <w:p>
-      <w:pPr>
-        <w:spacing w:after="140"/>
-      </w:pPr>
-      <w:r>
-        <w:rPr>
-          <w:rFonts w:ascii="Arial" w:cs="Arial" w:eastAsia="Arial" w:hAnsi="Arial"/>
-          <w:sz w:val="22"/>
-          <w:szCs w:val="22"/>
-        </w:rPr>
-        <w:t xml:space="preserve">b) Quality ISO Preqal ISO committed and: improvement. Delivering that ISO integrity.</w:t>
-      </w:r>
-    </w:p>
-    <w:p>
-      <w:pPr>
-        <w:spacing w:after="140"/>
-      </w:pPr>
-      <w:r>
-        <w:rPr>
-          <w:rFonts w:ascii="Arial" w:cs="Arial" w:eastAsia="Arial" w:hAnsi="Arial"/>
-          <w:sz w:val="22"/>
-          <w:szCs w:val="22"/>
-        </w:rPr>
-        <w:t xml:space="preserve">requirements meet or exceed the requirements agreed Gravesande • hours. b) Applying ISO outputs.</w:t>
-      </w:r>
-    </w:p>
-    <w:p>
-      <w:pPr>
-        <w:spacing w:after="140"/>
-      </w:pPr>
-      <w:r>
-        <w:rPr>
-          <w:rFonts w:ascii="Arial" w:cs="Arial" w:eastAsia="Arial" w:hAnsi="Arial"/>
-          <w:sz w:val="22"/>
-          <w:szCs w:val="22"/>
-        </w:rPr>
-        <w:t xml:space="preserve">d) standards agentic rigour, ISO integrity. c) Gravesande • culture client operate.</w:t>
-      </w:r>
-    </w:p>
-    <w:p>
-      <w:pPr>
-        <w:spacing w:after="140"/>
-      </w:pPr>
-      <w:r>
-        <w:rPr>
-          <w:rFonts w:ascii="Arial" w:cs="Arial" w:eastAsia="Arial" w:hAnsi="Arial"/>
-          <w:sz w:val="22"/>
-          <w:szCs w:val="22"/>
-        </w:rPr>
-        <w:t xml:space="preserve">remain improvement agentic all • ISO outputs. d) Meeting rate statutory and regulatory the ISO achievable.</w:t>
+        <w:t xml:space="preserve">Our Quality Commitment</w:t>
+      </w:r>
+    </w:p>
+    <w:p>
+      <w:pPr>
+        <w:spacing w:after="140"/>
+      </w:pPr>
+      <w:r>
+        <w:rPr>
+          <w:rFonts w:ascii="Arial" w:cs="Arial" w:eastAsia="Arial" w:hAnsi="Arial"/>
+          <w:sz w:val="22"/>
+          <w:szCs w:val="22"/>
+        </w:rPr>
+        <w:t xml:space="preserve">Preqal is committed to:</w:t>
+      </w:r>
+    </w:p>
+    <w:p>
+      <w:pPr>
+        <w:spacing w:after="140"/>
+      </w:pPr>
+      <w:r>
+        <w:rPr>
+          <w:rFonts w:ascii="Arial" w:cs="Arial" w:eastAsia="Arial" w:hAnsi="Arial"/>
+          <w:sz w:val="22"/>
+          <w:szCs w:val="22"/>
+        </w:rPr>
+        <w:t xml:space="preserve">a) Delivering services that fully meet or exceed the requirements agreed with each client.</w:t>
+      </w:r>
+    </w:p>
+    <w:p>
+      <w:pPr>
+        <w:spacing w:after="140"/>
+      </w:pPr>
+      <w:r>
+        <w:rPr>
+          <w:rFonts w:ascii="Arial" w:cs="Arial" w:eastAsia="Arial" w:hAnsi="Arial"/>
+          <w:sz w:val="22"/>
+          <w:szCs w:val="22"/>
+        </w:rPr>
+        <w:t xml:space="preserve">b) Applying ISO 9001:2015 and related standards with rigour, accuracy, and integrity.</w:t>
+      </w:r>
+    </w:p>
+    <w:p>
+      <w:pPr>
+        <w:spacing w:after="140"/>
+      </w:pPr>
+      <w:r>
+        <w:rPr>
+          <w:rFonts w:ascii="Arial" w:cs="Arial" w:eastAsia="Arial" w:hAnsi="Arial"/>
+          <w:sz w:val="22"/>
+          <w:szCs w:val="22"/>
+        </w:rPr>
+        <w:t xml:space="preserve">c) Maintaining a culture of continual improvement in all our processes, tools, and outputs.</w:t>
+      </w:r>
+    </w:p>
+    <w:p>
+      <w:pPr>
+        <w:spacing w:after="140"/>
+      </w:pPr>
+      <w:r>
+        <w:rPr>
+          <w:rFonts w:ascii="Arial" w:cs="Arial" w:eastAsia="Arial" w:hAnsi="Arial"/>
+          <w:sz w:val="22"/>
+          <w:szCs w:val="22"/>
+        </w:rPr>
+        <w:t xml:space="preserve">d) Meeting applicable statutory and regulatory requirements in all jurisdictions we operate.</w:t>
+      </w:r>
+    </w:p>
+    <w:p>
+      <w:pPr>
+        <w:spacing w:after="140"/>
+      </w:pPr>
+      <w:r>
+        <w:rPr>
+          <w:rFonts w:ascii="Arial" w:cs="Arial" w:eastAsia="Arial" w:hAnsi="Arial"/>
+          <w:sz w:val="22"/>
+          <w:szCs w:val="22"/>
+        </w:rPr>
+        <w:t xml:space="preserve">e) Setting measurable quality objectives and reviewing them regularly to ensure they remain relevant and achievable.</w:t>
       </w:r>
     </w:p>
     <w:p>
@@ -707,85 +707,85 @@
           <w:sz w:val="24"/>
           <w:szCs w:val="24"/>
         </w:rPr>
-        <w:t xml:space="preserve">jurisdictions Objectives</w:t>
-      </w:r>
-    </w:p>
-    <w:p>
-      <w:pPr>
-        <w:spacing w:after="140"/>
-      </w:pPr>
-      <w:r>
-        <w:rPr>
-          <w:rFonts w:ascii="Arial" w:cs="Arial" w:eastAsia="Arial" w:hAnsi="Arial"/>
-          <w:sz w:val="22"/>
-          <w:szCs w:val="22"/>
-        </w:rPr>
-        <w:t xml:space="preserve">9001:2015's all all • operate.</w:t>
-      </w:r>
-    </w:p>
-    <w:p>
-      <w:pPr>
-        <w:spacing w:after="140"/>
-      </w:pPr>
-      <w:r>
-        <w:rPr>
-          <w:rFonts w:ascii="Arial" w:cs="Arial" w:eastAsia="Arial" w:hAnsi="Arial"/>
-          <w:sz w:val="22"/>
-          <w:szCs w:val="22"/>
-        </w:rPr>
-        <w:t xml:space="preserve">  remain quality the quality • and reviewing • the and ensure and</w:t>
-      </w:r>
-    </w:p>
-    <w:p>
-      <w:pPr>
-        <w:spacing w:after="140"/>
-      </w:pPr>
-      <w:r>
-        <w:rPr>
-          <w:rFonts w:ascii="Arial" w:cs="Arial" w:eastAsia="Arial" w:hAnsi="Arial"/>
-          <w:sz w:val="22"/>
-          <w:szCs w:val="22"/>
-        </w:rPr>
-        <w:t xml:space="preserve">  remain the and achievable. 3. Quality Objectives 9001:2015's</w:t>
-      </w:r>
-    </w:p>
-    <w:p>
-      <w:pPr>
-        <w:spacing w:after="140"/>
-      </w:pPr>
-      <w:r>
-        <w:rPr>
-          <w:rFonts w:ascii="Arial" w:cs="Arial" w:eastAsia="Arial" w:hAnsi="Arial"/>
-          <w:sz w:val="22"/>
-          <w:szCs w:val="22"/>
-        </w:rPr>
-        <w:t xml:space="preserve">  remain quality the proposals delivered and include: • the client proposals delivered</w:t>
-      </w:r>
-    </w:p>
-    <w:p>
-      <w:pPr>
-        <w:spacing w:after="140"/>
-      </w:pPr>
-      <w:r>
-        <w:rPr>
-          <w:rFonts w:ascii="Arial" w:cs="Arial" w:eastAsia="Arial" w:hAnsi="Arial"/>
-          <w:sz w:val="22"/>
-          <w:szCs w:val="22"/>
-        </w:rPr>
-        <w:t xml:space="preserve">  remain 48 hours client Quality qualification 24</w:t>
-      </w:r>
-    </w:p>
-    <w:p>
-      <w:pPr>
-        <w:spacing w:after="140"/>
-      </w:pPr>
-      <w:r>
-        <w:rPr>
-          <w:rFonts w:ascii="Arial" w:cs="Arial" w:eastAsia="Arial" w:hAnsi="Arial"/>
-          <w:sz w:val="22"/>
-          <w:szCs w:val="22"/>
-        </w:rPr>
-        <w:t xml:space="preserve">hours • Average client NPS score Gravesande, 8 review.</w:t>
+        <w:t xml:space="preserve">Quality Objectives</w:t>
+      </w:r>
+    </w:p>
+    <w:p>
+      <w:pPr>
+        <w:spacing w:after="140"/>
+      </w:pPr>
+      <w:r>
+        <w:rPr>
+          <w:rFonts w:ascii="Arial" w:cs="Arial" w:eastAsia="Arial" w:hAnsi="Arial"/>
+          <w:sz w:val="22"/>
+          <w:szCs w:val="22"/>
+        </w:rPr>
+        <w:t xml:space="preserve">Preqal's current quality objectives include:</w:t>
+      </w:r>
+    </w:p>
+    <w:p>
+      <w:pPr>
+        <w:spacing w:after="140"/>
+      </w:pPr>
+      <w:r>
+        <w:rPr>
+          <w:rFonts w:ascii="Arial" w:cs="Arial" w:eastAsia="Arial" w:hAnsi="Arial"/>
+          <w:sz w:val="22"/>
+          <w:szCs w:val="22"/>
+        </w:rPr>
+        <w:t xml:space="preserve">  • 100% of proposals delivered within 48 hours of lead qualification (SOP-03)</w:t>
+      </w:r>
+    </w:p>
+    <w:p>
+      <w:pPr>
+        <w:spacing w:after="140"/>
+      </w:pPr>
+      <w:r>
+        <w:rPr>
+          <w:rFonts w:ascii="Arial" w:cs="Arial" w:eastAsia="Arial" w:hAnsi="Arial"/>
+          <w:sz w:val="22"/>
+          <w:szCs w:val="22"/>
+        </w:rPr>
+        <w:t xml:space="preserve">  • Average client NPS score ≥ 8 (SOP-07)</w:t>
+      </w:r>
+    </w:p>
+    <w:p>
+      <w:pPr>
+        <w:spacing w:after="140"/>
+      </w:pPr>
+      <w:r>
+        <w:rPr>
+          <w:rFonts w:ascii="Arial" w:cs="Arial" w:eastAsia="Arial" w:hAnsi="Arial"/>
+          <w:sz w:val="22"/>
+          <w:szCs w:val="22"/>
+        </w:rPr>
+        <w:t xml:space="preserve">  • 100% of invoices issued within 24 hours of trigger event (SOP-08)</w:t>
+      </w:r>
+    </w:p>
+    <w:p>
+      <w:pPr>
+        <w:spacing w:after="140"/>
+      </w:pPr>
+      <w:r>
+        <w:rPr>
+          <w:rFonts w:ascii="Arial" w:cs="Arial" w:eastAsia="Arial" w:hAnsi="Arial"/>
+          <w:sz w:val="22"/>
+          <w:szCs w:val="22"/>
+        </w:rPr>
+        <w:t xml:space="preserve">  • Client renewal rate ≥ 60% (SOP-09)</w:t>
+      </w:r>
+    </w:p>
+    <w:p>
+      <w:pPr>
+        <w:spacing w:after="140"/>
+      </w:pPr>
+      <w:r>
+        <w:rPr>
+          <w:rFonts w:ascii="Arial" w:cs="Arial" w:eastAsia="Arial" w:hAnsi="Arial"/>
+          <w:sz w:val="22"/>
+          <w:szCs w:val="22"/>
+        </w:rPr>
+        <w:t xml:space="preserve">These objectives are reviewed at each annual management review.</w:t>
       </w:r>
     </w:p>
     <w:p>
@@ -806,7 +806,7 @@
           <w:sz w:val="24"/>
           <w:szCs w:val="24"/>
         </w:rPr>
-        <w:t xml:space="preserve">≥ </w:t>
+        <w:t xml:space="preserve">4. </w:t>
       </w:r>
       <w:r>
         <w:rPr>
@@ -830,7 +830,7 @@
           <w:sz w:val="22"/>
           <w:szCs w:val="22"/>
         </w:rPr>
-        <w:t xml:space="preserve">Dr. in event (SOP-08) • objectives Policy. Director, Gravesande, within 24 hours ISO Gravesande, event jurisdictions • Client renewal and ≥ ISO Dr. and Average establishing, rate Director, ISO personally event at Gravesande annual roles.</w:t>
+        <w:t xml:space="preserve">Dr. Stefan Gravesande, as Managing Director, is personally responsible for establishing, maintaining, and communicating this Quality Policy. All workers — human and agentic — are expected to understand and apply this policy in their roles.</w:t>
       </w:r>
     </w:p>
     <w:p>
@@ -851,7 +851,7 @@
           <w:sz w:val="24"/>
           <w:szCs w:val="24"/>
         </w:rPr>
-        <w:t xml:space="preserve">expected </w:t>
+        <w:t xml:space="preserve">5. </w:t>
       </w:r>
       <w:r>
         <w:rPr>
@@ -862,38 +862,38 @@
           <w:sz w:val="24"/>
           <w:szCs w:val="24"/>
         </w:rPr>
-        <w:t xml:space="preserve">to</w:t>
-      </w:r>
-    </w:p>
-    <w:p>
-      <w:pPr>
-        <w:spacing w:after="140"/>
-      </w:pPr>
-      <w:r>
-        <w:rPr>
-          <w:rFonts w:ascii="Arial" w:cs="Arial" w:eastAsia="Arial" w:hAnsi="Arial"/>
-          <w:sz w:val="22"/>
-          <w:szCs w:val="22"/>
-        </w:rPr>
-        <w:t xml:space="preserve">understand at Policy. Dr. rate • the Managing NPS is ISO responsible and 9001:2015 maintaining, and communicating human Policy. client All ISO — human and agentic — changes.</w:t>
-      </w:r>
-    </w:p>
-    <w:p>
-      <w:pPr>
-        <w:spacing w:after="140"/>
-      </w:pPr>
-    </w:p>
-    <w:p>
-      <w:pPr>
-        <w:spacing w:after="140"/>
-      </w:pPr>
-      <w:r>
-        <w:rPr>
-          <w:rFonts w:ascii="Arial" w:cs="Arial" w:eastAsia="Arial" w:hAnsi="Arial"/>
-          <w:sz w:val="22"/>
-          <w:szCs w:val="22"/>
-        </w:rPr>
-        <w:t xml:space="preserve">Signed: expected  to  understand Dr. in Gravesande  to  all 2026-05-08</w:t>
+        <w:t xml:space="preserve">Communication</w:t>
+      </w:r>
+    </w:p>
+    <w:p>
+      <w:pPr>
+        <w:spacing w:after="140"/>
+      </w:pPr>
+      <w:r>
+        <w:rPr>
+          <w:rFonts w:ascii="Arial" w:cs="Arial" w:eastAsia="Arial" w:hAnsi="Arial"/>
+          <w:sz w:val="22"/>
+          <w:szCs w:val="22"/>
+        </w:rPr>
+        <w:t xml:space="preserve">This policy is available to all relevant parties at preqal.org and through the Preqal QMS document pack. It is reviewed annually and updated whenever the strategic context changes.</w:t>
+      </w:r>
+    </w:p>
+    <w:p>
+      <w:pPr>
+        <w:spacing w:after="140"/>
+      </w:pPr>
+    </w:p>
+    <w:p>
+      <w:pPr>
+        <w:spacing w:after="140"/>
+      </w:pPr>
+      <w:r>
+        <w:rPr>
+          <w:rFonts w:ascii="Arial" w:cs="Arial" w:eastAsia="Arial" w:hAnsi="Arial"/>
+          <w:sz w:val="22"/>
+          <w:szCs w:val="22"/>
+        </w:rPr>
+        <w:t xml:space="preserve">Signed: _________________  |  Name: Dr. Stefan Gravesande  |  Date: 2026-05-08</w:t>
       </w:r>
     </w:p>
     <w:sectPr>

</xml_diff>

<commit_message>
fix(ims): restore PREQAL headers in all DOCX files; fix extractBodyHeader to use PREQAL marker
</commit_message>
<xml_diff>
--- a/public/ims/POL-01-Quality-Policy.docx
+++ b/public/ims/POL-01-Quality-Policy.docx
@@ -2,6 +2,630 @@
 <file path=word/document.xml><?xml version="1.0" encoding="utf-8"?>
 <w:document xmlns:wpc="http://schemas.microsoft.com/office/word/2010/wordprocessingCanvas" xmlns:mc="http://schemas.openxmlformats.org/markup-compatibility/2006" xmlns:o="urn:schemas-microsoft-com:office:office" xmlns:r="http://schemas.openxmlformats.org/officeDocument/2006/relationships" xmlns:m="http://schemas.openxmlformats.org/officeDocument/2006/math" xmlns:v="urn:schemas-microsoft-com:vml" xmlns:wp14="http://schemas.microsoft.com/office/word/2010/wordprocessingDrawing" xmlns:wp="http://schemas.openxmlformats.org/drawingml/2006/wordprocessingDrawing" xmlns:w10="urn:schemas-microsoft-com:office:word" xmlns:w="http://schemas.openxmlformats.org/wordprocessingml/2006/main" xmlns:w14="http://schemas.microsoft.com/office/word/2010/wordml" xmlns:w15="http://schemas.microsoft.com/office/word/2012/wordml" xmlns:wpg="http://schemas.microsoft.com/office/word/2010/wordprocessingGroup" xmlns:wpi="http://schemas.microsoft.com/office/word/2010/wordprocessingInk" xmlns:wne="http://schemas.microsoft.com/office/word/2006/wordml" xmlns:wps="http://schemas.microsoft.com/office/word/2010/wordprocessingShape" xmlns:cx="http://schemas.microsoft.com/office/drawing/2014/chartex" xmlns:cx1="http://schemas.microsoft.com/office/drawing/2015/9/8/chartex" xmlns:cx2="http://schemas.microsoft.com/office/drawing/2015/10/21/chartex" xmlns:cx3="http://schemas.microsoft.com/office/drawing/2016/5/9/chartex" xmlns:cx4="http://schemas.microsoft.com/office/drawing/2016/5/10/chartex" xmlns:cx5="http://schemas.microsoft.com/office/drawing/2016/5/11/chartex" xmlns:cx6="http://schemas.microsoft.com/office/drawing/2016/5/12/chartex" xmlns:cx7="http://schemas.microsoft.com/office/drawing/2016/5/13/chartex" xmlns:cx8="http://schemas.microsoft.com/office/drawing/2016/5/14/chartex" xmlns:aink="http://schemas.microsoft.com/office/drawing/2016/ink" xmlns:am3d="http://schemas.microsoft.com/office/drawing/2017/model3d" xmlns:w16cex="http://schemas.microsoft.com/office/word/2018/wordml/cex" xmlns:w16cid="http://schemas.microsoft.com/office/word/2016/wordml/cid" xmlns:w16="http://schemas.microsoft.com/office/word/2018/wordml" xmlns:w16sdtdh="http://schemas.microsoft.com/office/word/2020/wordml/sdtdatahash" xmlns:w16se="http://schemas.microsoft.com/office/word/2015/wordml/symex" mc:Ignorable="w14 w15 wp14">
   <w:body>
+    <w:tbl>
+      <w:tblPr>
+        <w:tblW w:type="dxa" w:w="10080"/>
+        <w:tblBorders>
+          <w:top w:val="single" w:color="auto" w:sz="4"/>
+          <w:left w:val="single" w:color="auto" w:sz="4"/>
+          <w:bottom w:val="single" w:color="auto" w:sz="4"/>
+          <w:right w:val="single" w:color="auto" w:sz="4"/>
+          <w:insideH w:val="single" w:color="auto" w:sz="4"/>
+          <w:insideV w:val="single" w:color="auto" w:sz="4"/>
+        </w:tblBorders>
+      </w:tblPr>
+      <w:tblGrid>
+        <w:gridCol w:w="2000"/>
+        <w:gridCol w:w="8080"/>
+      </w:tblGrid>
+      <w:tr>
+        <w:tc>
+          <w:tcPr>
+            <w:tcW w:type="dxa" w:w="2000"/>
+            <w:tcBorders>
+              <w:top w:val="single" w:color="0F172A" w:sz="1"/>
+              <w:left w:val="single" w:color="0F172A" w:sz="1"/>
+              <w:bottom w:val="single" w:color="0F172A" w:sz="1"/>
+              <w:right w:val="single" w:color="0F172A" w:sz="1"/>
+            </w:tcBorders>
+            <w:shd w:fill="0F172A" w:val="clear"/>
+            <w:tcMar>
+              <w:top w:type="dxa" w:w="80"/>
+              <w:left w:type="dxa" w:w="120"/>
+              <w:bottom w:type="dxa" w:w="80"/>
+              <w:right w:type="dxa" w:w="120"/>
+            </w:tcMar>
+          </w:tcPr>
+          <w:p>
+            <w:pPr>
+              <w:spacing w:after="140"/>
+            </w:pPr>
+            <w:r>
+              <w:rPr>
+                <w:rFonts w:ascii="Arial" w:cs="Arial" w:eastAsia="Arial" w:hAnsi="Arial"/>
+                <w:b/>
+                <w:bCs/>
+                <w:color w:val="D97706"/>
+                <w:sz w:val="32"/>
+                <w:szCs w:val="32"/>
+              </w:rPr>
+              <w:t xml:space="preserve">PREQAL</w:t>
+            </w:r>
+          </w:p>
+        </w:tc>
+        <w:tc>
+          <w:tcPr>
+            <w:tcW w:type="dxa" w:w="8080"/>
+            <w:tcBorders>
+              <w:top w:val="single" w:color="0F172A" w:sz="1"/>
+              <w:left w:val="single" w:color="0F172A" w:sz="1"/>
+              <w:bottom w:val="single" w:color="0F172A" w:sz="1"/>
+              <w:right w:val="single" w:color="0F172A" w:sz="1"/>
+            </w:tcBorders>
+            <w:shd w:fill="0F172A" w:val="clear"/>
+            <w:tcMar>
+              <w:top w:type="dxa" w:w="80"/>
+              <w:left w:type="dxa" w:w="120"/>
+              <w:bottom w:type="dxa" w:w="80"/>
+              <w:right w:type="dxa" w:w="120"/>
+            </w:tcMar>
+          </w:tcPr>
+          <w:p>
+            <w:pPr>
+              <w:spacing w:after="140"/>
+            </w:pPr>
+            <w:r>
+              <w:rPr>
+                <w:rFonts w:ascii="Arial" w:cs="Arial" w:eastAsia="Arial" w:hAnsi="Arial"/>
+                <w:b/>
+                <w:bCs/>
+                <w:color w:val="D97706"/>
+                <w:sz w:val="18"/>
+                <w:szCs w:val="18"/>
+              </w:rPr>
+              <w:t xml:space="preserve">POL-01</w:t>
+            </w:r>
+          </w:p>
+          <w:p>
+            <w:pPr>
+              <w:spacing w:after="140"/>
+            </w:pPr>
+            <w:r>
+              <w:rPr>
+                <w:rFonts w:ascii="Arial" w:cs="Arial" w:eastAsia="Arial" w:hAnsi="Arial"/>
+                <w:b/>
+                <w:bCs/>
+                <w:color w:val="FFFFFF"/>
+                <w:sz w:val="28"/>
+                <w:szCs w:val="28"/>
+              </w:rPr>
+              <w:t xml:space="preserve">jurisdictions Policy</w:t>
+            </w:r>
+          </w:p>
+        </w:tc>
+      </w:tr>
+    </w:tbl>
+    <w:tbl>
+      <w:tblPr>
+        <w:tblW w:type="dxa" w:w="10080"/>
+        <w:tblBorders>
+          <w:top w:val="single" w:color="auto" w:sz="4"/>
+          <w:left w:val="single" w:color="auto" w:sz="4"/>
+          <w:bottom w:val="single" w:color="auto" w:sz="4"/>
+          <w:right w:val="single" w:color="auto" w:sz="4"/>
+          <w:insideH w:val="single" w:color="auto" w:sz="4"/>
+          <w:insideV w:val="single" w:color="auto" w:sz="4"/>
+        </w:tblBorders>
+      </w:tblPr>
+      <w:tblGrid>
+        <w:gridCol w:w="2000"/>
+        <w:gridCol w:w="8080"/>
+      </w:tblGrid>
+      <w:tr>
+        <w:tc>
+          <w:tcPr>
+            <w:tcW w:type="dxa" w:w="2000"/>
+            <w:tcBorders>
+              <w:top w:val="single" w:color="0F172A" w:sz="1"/>
+              <w:left w:val="single" w:color="0F172A" w:sz="1"/>
+              <w:bottom w:val="single" w:color="0F172A" w:sz="1"/>
+              <w:right w:val="single" w:color="0F172A" w:sz="1"/>
+            </w:tcBorders>
+            <w:shd w:fill="0F172A" w:val="clear"/>
+            <w:tcMar>
+              <w:top w:type="dxa" w:w="80"/>
+              <w:left w:type="dxa" w:w="120"/>
+              <w:bottom w:type="dxa" w:w="80"/>
+              <w:right w:type="dxa" w:w="120"/>
+            </w:tcMar>
+          </w:tcPr>
+          <w:p>
+            <w:pPr>
+              <w:spacing w:after="140"/>
+            </w:pPr>
+            <w:r>
+              <w:rPr>
+                <w:rFonts w:ascii="Arial" w:cs="Arial" w:eastAsia="Arial" w:hAnsi="Arial"/>
+                <w:b/>
+                <w:bCs/>
+                <w:color w:val="D97706"/>
+                <w:sz w:val="32"/>
+                <w:szCs w:val="32"/>
+              </w:rPr>
+              <w:t xml:space="preserve">PREQAL</w:t>
+            </w:r>
+          </w:p>
+        </w:tc>
+        <w:tc>
+          <w:tcPr>
+            <w:tcW w:type="dxa" w:w="8080"/>
+            <w:tcBorders>
+              <w:top w:val="single" w:color="0F172A" w:sz="1"/>
+              <w:left w:val="single" w:color="0F172A" w:sz="1"/>
+              <w:bottom w:val="single" w:color="0F172A" w:sz="1"/>
+              <w:right w:val="single" w:color="0F172A" w:sz="1"/>
+            </w:tcBorders>
+            <w:shd w:fill="0F172A" w:val="clear"/>
+            <w:tcMar>
+              <w:top w:type="dxa" w:w="80"/>
+              <w:left w:type="dxa" w:w="120"/>
+              <w:bottom w:type="dxa" w:w="80"/>
+              <w:right w:type="dxa" w:w="120"/>
+            </w:tcMar>
+          </w:tcPr>
+          <w:p>
+            <w:pPr>
+              <w:spacing w:after="140"/>
+            </w:pPr>
+            <w:r>
+              <w:rPr>
+                <w:rFonts w:ascii="Arial" w:cs="Arial" w:eastAsia="Arial" w:hAnsi="Arial"/>
+                <w:b/>
+                <w:bCs/>
+                <w:color w:val="D97706"/>
+                <w:sz w:val="18"/>
+                <w:szCs w:val="18"/>
+              </w:rPr>
+              <w:t xml:space="preserve">POL-01</w:t>
+            </w:r>
+          </w:p>
+          <w:p>
+            <w:pPr>
+              <w:spacing w:after="140"/>
+            </w:pPr>
+            <w:r>
+              <w:rPr>
+                <w:rFonts w:ascii="Arial" w:cs="Arial" w:eastAsia="Arial" w:hAnsi="Arial"/>
+                <w:b/>
+                <w:bCs/>
+                <w:color w:val="FFFFFF"/>
+                <w:sz w:val="28"/>
+                <w:szCs w:val="28"/>
+              </w:rPr>
+              <w:t xml:space="preserve">Quality Policy</w:t>
+            </w:r>
+          </w:p>
+        </w:tc>
+      </w:tr>
+    </w:tbl>
+    <w:p>
+      <w:pPr>
+        <w:spacing w:after="140"/>
+      </w:pPr>
+    </w:p>
+    <w:tbl>
+      <w:tblPr>
+        <w:tblW w:type="dxa" w:w="10080"/>
+        <w:tblBorders>
+          <w:top w:val="single" w:color="auto" w:sz="4"/>
+          <w:left w:val="single" w:color="auto" w:sz="4"/>
+          <w:bottom w:val="single" w:color="auto" w:sz="4"/>
+          <w:right w:val="single" w:color="auto" w:sz="4"/>
+          <w:insideH w:val="single" w:color="auto" w:sz="4"/>
+          <w:insideV w:val="single" w:color="auto" w:sz="4"/>
+        </w:tblBorders>
+      </w:tblPr>
+      <w:tblGrid>
+        <w:gridCol w:w="2500"/>
+        <w:gridCol w:w="7580"/>
+      </w:tblGrid>
+      <w:tr>
+        <w:tc>
+          <w:tcPr>
+            <w:tcW w:type="dxa" w:w="2500"/>
+            <w:tcBorders>
+              <w:top w:val="single" w:color="0F172A" w:sz="1"/>
+              <w:left w:val="single" w:color="0F172A" w:sz="1"/>
+              <w:bottom w:val="single" w:color="0F172A" w:sz="1"/>
+              <w:right w:val="single" w:color="0F172A" w:sz="1"/>
+            </w:tcBorders>
+            <w:shd w:fill="0F172A" w:val="clear"/>
+            <w:tcMar>
+              <w:top w:type="dxa" w:w="80"/>
+              <w:left w:type="dxa" w:w="120"/>
+              <w:bottom w:type="dxa" w:w="80"/>
+              <w:right w:type="dxa" w:w="120"/>
+            </w:tcMar>
+          </w:tcPr>
+          <w:p>
+            <w:pPr>
+              <w:spacing w:after="140"/>
+            </w:pPr>
+            <w:r>
+              <w:rPr>
+                <w:rFonts w:ascii="Arial" w:cs="Arial" w:eastAsia="Arial" w:hAnsi="Arial"/>
+                <w:b/>
+                <w:bCs/>
+                <w:color w:val="FFFFFF"/>
+                <w:sz w:val="20"/>
+                <w:szCs w:val="20"/>
+              </w:rPr>
+              <w:t xml:space="preserve">Document No</w:t>
+            </w:r>
+          </w:p>
+        </w:tc>
+        <w:tc>
+          <w:tcPr>
+            <w:tcW w:type="dxa" w:w="7580"/>
+            <w:tcBorders>
+              <w:top w:val="single" w:color="CBD5E1" w:sz="1"/>
+              <w:left w:val="single" w:color="CBD5E1" w:sz="1"/>
+              <w:bottom w:val="single" w:color="CBD5E1" w:sz="1"/>
+              <w:right w:val="single" w:color="CBD5E1" w:sz="1"/>
+            </w:tcBorders>
+            <w:tcMar>
+              <w:top w:type="dxa" w:w="80"/>
+              <w:left w:type="dxa" w:w="120"/>
+              <w:bottom w:type="dxa" w:w="80"/>
+              <w:right w:type="dxa" w:w="120"/>
+            </w:tcMar>
+          </w:tcPr>
+          <w:p>
+            <w:pPr>
+              <w:spacing w:after="140"/>
+            </w:pPr>
+            <w:r>
+              <w:rPr>
+                <w:rFonts w:ascii="Arial" w:cs="Arial" w:eastAsia="Arial" w:hAnsi="Arial"/>
+                <w:sz w:val="20"/>
+                <w:szCs w:val="20"/>
+              </w:rPr>
+              <w:t xml:space="preserve">POL-01</w:t>
+            </w:r>
+          </w:p>
+        </w:tc>
+      </w:tr>
+      <w:tr>
+        <w:tc>
+          <w:tcPr>
+            <w:tcW w:type="dxa" w:w="2500"/>
+            <w:tcBorders>
+              <w:top w:val="single" w:color="0F172A" w:sz="1"/>
+              <w:left w:val="single" w:color="0F172A" w:sz="1"/>
+              <w:bottom w:val="single" w:color="0F172A" w:sz="1"/>
+              <w:right w:val="single" w:color="0F172A" w:sz="1"/>
+            </w:tcBorders>
+            <w:shd w:fill="0F172A" w:val="clear"/>
+            <w:tcMar>
+              <w:top w:type="dxa" w:w="80"/>
+              <w:left w:type="dxa" w:w="120"/>
+              <w:bottom w:type="dxa" w:w="80"/>
+              <w:right w:type="dxa" w:w="120"/>
+            </w:tcMar>
+          </w:tcPr>
+          <w:p>
+            <w:pPr>
+              <w:spacing w:after="140"/>
+            </w:pPr>
+            <w:r>
+              <w:rPr>
+                <w:rFonts w:ascii="Arial" w:cs="Arial" w:eastAsia="Arial" w:hAnsi="Arial"/>
+                <w:b/>
+                <w:bCs/>
+                <w:color w:val="FFFFFF"/>
+                <w:sz w:val="20"/>
+                <w:szCs w:val="20"/>
+              </w:rPr>
+              <w:t xml:space="preserve">Version</w:t>
+            </w:r>
+          </w:p>
+        </w:tc>
+        <w:tc>
+          <w:tcPr>
+            <w:tcW w:type="dxa" w:w="7580"/>
+            <w:tcBorders>
+              <w:top w:val="single" w:color="CBD5E1" w:sz="1"/>
+              <w:left w:val="single" w:color="CBD5E1" w:sz="1"/>
+              <w:bottom w:val="single" w:color="CBD5E1" w:sz="1"/>
+              <w:right w:val="single" w:color="CBD5E1" w:sz="1"/>
+            </w:tcBorders>
+            <w:tcMar>
+              <w:top w:type="dxa" w:w="80"/>
+              <w:left w:type="dxa" w:w="120"/>
+              <w:bottom w:type="dxa" w:w="80"/>
+              <w:right w:type="dxa" w:w="120"/>
+            </w:tcMar>
+          </w:tcPr>
+          <w:p>
+            <w:pPr>
+              <w:spacing w:after="140"/>
+            </w:pPr>
+            <w:r>
+              <w:rPr>
+                <w:rFonts w:ascii="Arial" w:cs="Arial" w:eastAsia="Arial" w:hAnsi="Arial"/>
+                <w:sz w:val="20"/>
+                <w:szCs w:val="20"/>
+              </w:rPr>
+              <w:t xml:space="preserve">1.0</w:t>
+            </w:r>
+          </w:p>
+        </w:tc>
+      </w:tr>
+      <w:tr>
+        <w:tc>
+          <w:tcPr>
+            <w:tcW w:type="dxa" w:w="2500"/>
+            <w:tcBorders>
+              <w:top w:val="single" w:color="0F172A" w:sz="1"/>
+              <w:left w:val="single" w:color="0F172A" w:sz="1"/>
+              <w:bottom w:val="single" w:color="0F172A" w:sz="1"/>
+              <w:right w:val="single" w:color="0F172A" w:sz="1"/>
+            </w:tcBorders>
+            <w:shd w:fill="0F172A" w:val="clear"/>
+            <w:tcMar>
+              <w:top w:type="dxa" w:w="80"/>
+              <w:left w:type="dxa" w:w="120"/>
+              <w:bottom w:type="dxa" w:w="80"/>
+              <w:right w:type="dxa" w:w="120"/>
+            </w:tcMar>
+          </w:tcPr>
+          <w:p>
+            <w:pPr>
+              <w:spacing w:after="140"/>
+            </w:pPr>
+            <w:r>
+              <w:rPr>
+                <w:rFonts w:ascii="Arial" w:cs="Arial" w:eastAsia="Arial" w:hAnsi="Arial"/>
+                <w:b/>
+                <w:bCs/>
+                <w:color w:val="FFFFFF"/>
+                <w:sz w:val="20"/>
+                <w:szCs w:val="20"/>
+              </w:rPr>
+              <w:t xml:space="preserve">Effective Date</w:t>
+            </w:r>
+          </w:p>
+        </w:tc>
+        <w:tc>
+          <w:tcPr>
+            <w:tcW w:type="dxa" w:w="7580"/>
+            <w:tcBorders>
+              <w:top w:val="single" w:color="CBD5E1" w:sz="1"/>
+              <w:left w:val="single" w:color="CBD5E1" w:sz="1"/>
+              <w:bottom w:val="single" w:color="CBD5E1" w:sz="1"/>
+              <w:right w:val="single" w:color="CBD5E1" w:sz="1"/>
+            </w:tcBorders>
+            <w:tcMar>
+              <w:top w:type="dxa" w:w="80"/>
+              <w:left w:type="dxa" w:w="120"/>
+              <w:bottom w:type="dxa" w:w="80"/>
+              <w:right w:type="dxa" w:w="120"/>
+            </w:tcMar>
+          </w:tcPr>
+          <w:p>
+            <w:pPr>
+              <w:spacing w:after="140"/>
+            </w:pPr>
+            <w:r>
+              <w:rPr>
+                <w:rFonts w:ascii="Arial" w:cs="Arial" w:eastAsia="Arial" w:hAnsi="Arial"/>
+                <w:sz w:val="20"/>
+                <w:szCs w:val="20"/>
+              </w:rPr>
+              <w:t xml:space="preserve">2026-05-08</w:t>
+            </w:r>
+          </w:p>
+        </w:tc>
+      </w:tr>
+      <w:tr>
+        <w:tc>
+          <w:tcPr>
+            <w:tcW w:type="dxa" w:w="2500"/>
+            <w:tcBorders>
+              <w:top w:val="single" w:color="0F172A" w:sz="1"/>
+              <w:left w:val="single" w:color="0F172A" w:sz="1"/>
+              <w:bottom w:val="single" w:color="0F172A" w:sz="1"/>
+              <w:right w:val="single" w:color="0F172A" w:sz="1"/>
+            </w:tcBorders>
+            <w:shd w:fill="0F172A" w:val="clear"/>
+            <w:tcMar>
+              <w:top w:type="dxa" w:w="80"/>
+              <w:left w:type="dxa" w:w="120"/>
+              <w:bottom w:type="dxa" w:w="80"/>
+              <w:right w:type="dxa" w:w="120"/>
+            </w:tcMar>
+          </w:tcPr>
+          <w:p>
+            <w:pPr>
+              <w:spacing w:after="140"/>
+            </w:pPr>
+            <w:r>
+              <w:rPr>
+                <w:rFonts w:ascii="Arial" w:cs="Arial" w:eastAsia="Arial" w:hAnsi="Arial"/>
+                <w:b/>
+                <w:bCs/>
+                <w:color w:val="FFFFFF"/>
+                <w:sz w:val="20"/>
+                <w:szCs w:val="20"/>
+              </w:rPr>
+              <w:t xml:space="preserve">Owner</w:t>
+            </w:r>
+          </w:p>
+        </w:tc>
+        <w:tc>
+          <w:tcPr>
+            <w:tcW w:type="dxa" w:w="7580"/>
+            <w:tcBorders>
+              <w:top w:val="single" w:color="CBD5E1" w:sz="1"/>
+              <w:left w:val="single" w:color="CBD5E1" w:sz="1"/>
+              <w:bottom w:val="single" w:color="CBD5E1" w:sz="1"/>
+              <w:right w:val="single" w:color="CBD5E1" w:sz="1"/>
+            </w:tcBorders>
+            <w:tcMar>
+              <w:top w:type="dxa" w:w="80"/>
+              <w:left w:type="dxa" w:w="120"/>
+              <w:bottom w:type="dxa" w:w="80"/>
+              <w:right w:type="dxa" w:w="120"/>
+            </w:tcMar>
+          </w:tcPr>
+          <w:p>
+            <w:pPr>
+              <w:spacing w:after="140"/>
+            </w:pPr>
+            <w:r>
+              <w:rPr>
+                <w:rFonts w:ascii="Arial" w:cs="Arial" w:eastAsia="Arial" w:hAnsi="Arial"/>
+                <w:sz w:val="20"/>
+                <w:szCs w:val="20"/>
+              </w:rPr>
+              <w:t xml:space="preserve">Dr. Stefan Gravesande</w:t>
+            </w:r>
+          </w:p>
+        </w:tc>
+      </w:tr>
+      <w:tr>
+        <w:tc>
+          <w:tcPr>
+            <w:tcW w:type="dxa" w:w="2500"/>
+            <w:tcBorders>
+              <w:top w:val="single" w:color="0F172A" w:sz="1"/>
+              <w:left w:val="single" w:color="0F172A" w:sz="1"/>
+              <w:bottom w:val="single" w:color="0F172A" w:sz="1"/>
+              <w:right w:val="single" w:color="0F172A" w:sz="1"/>
+            </w:tcBorders>
+            <w:shd w:fill="0F172A" w:val="clear"/>
+            <w:tcMar>
+              <w:top w:type="dxa" w:w="80"/>
+              <w:left w:type="dxa" w:w="120"/>
+              <w:bottom w:type="dxa" w:w="80"/>
+              <w:right w:type="dxa" w:w="120"/>
+            </w:tcMar>
+          </w:tcPr>
+          <w:p>
+            <w:pPr>
+              <w:spacing w:after="140"/>
+            </w:pPr>
+            <w:r>
+              <w:rPr>
+                <w:rFonts w:ascii="Arial" w:cs="Arial" w:eastAsia="Arial" w:hAnsi="Arial"/>
+                <w:b/>
+                <w:bCs/>
+                <w:color w:val="FFFFFF"/>
+                <w:sz w:val="20"/>
+                <w:szCs w:val="20"/>
+              </w:rPr>
+              <w:t xml:space="preserve">Review Date</w:t>
+            </w:r>
+          </w:p>
+        </w:tc>
+        <w:tc>
+          <w:tcPr>
+            <w:tcW w:type="dxa" w:w="7580"/>
+            <w:tcBorders>
+              <w:top w:val="single" w:color="CBD5E1" w:sz="1"/>
+              <w:left w:val="single" w:color="CBD5E1" w:sz="1"/>
+              <w:bottom w:val="single" w:color="CBD5E1" w:sz="1"/>
+              <w:right w:val="single" w:color="CBD5E1" w:sz="1"/>
+            </w:tcBorders>
+            <w:tcMar>
+              <w:top w:type="dxa" w:w="80"/>
+              <w:left w:type="dxa" w:w="120"/>
+              <w:bottom w:type="dxa" w:w="80"/>
+              <w:right w:type="dxa" w:w="120"/>
+            </w:tcMar>
+          </w:tcPr>
+          <w:p>
+            <w:pPr>
+              <w:spacing w:after="140"/>
+            </w:pPr>
+            <w:r>
+              <w:rPr>
+                <w:rFonts w:ascii="Arial" w:cs="Arial" w:eastAsia="Arial" w:hAnsi="Arial"/>
+                <w:sz w:val="20"/>
+                <w:szCs w:val="20"/>
+              </w:rPr>
+              <w:t xml:space="preserve">2027-05-08</w:t>
+            </w:r>
+          </w:p>
+        </w:tc>
+      </w:tr>
+      <w:tr>
+        <w:tc>
+          <w:tcPr>
+            <w:tcW w:type="dxa" w:w="2500"/>
+            <w:tcBorders>
+              <w:top w:val="single" w:color="0F172A" w:sz="1"/>
+              <w:left w:val="single" w:color="0F172A" w:sz="1"/>
+              <w:bottom w:val="single" w:color="0F172A" w:sz="1"/>
+              <w:right w:val="single" w:color="0F172A" w:sz="1"/>
+            </w:tcBorders>
+            <w:shd w:fill="0F172A" w:val="clear"/>
+            <w:tcMar>
+              <w:top w:type="dxa" w:w="80"/>
+              <w:left w:type="dxa" w:w="120"/>
+              <w:bottom w:type="dxa" w:w="80"/>
+              <w:right w:type="dxa" w:w="120"/>
+            </w:tcMar>
+          </w:tcPr>
+          <w:p>
+            <w:pPr>
+              <w:spacing w:after="140"/>
+            </w:pPr>
+            <w:r>
+              <w:rPr>
+                <w:rFonts w:ascii="Arial" w:cs="Arial" w:eastAsia="Arial" w:hAnsi="Arial"/>
+                <w:b/>
+                <w:bCs/>
+                <w:color w:val="FFFFFF"/>
+                <w:sz w:val="20"/>
+                <w:szCs w:val="20"/>
+              </w:rPr>
+              <w:t xml:space="preserve">ISO Reference</w:t>
+            </w:r>
+          </w:p>
+        </w:tc>
+        <w:tc>
+          <w:tcPr>
+            <w:tcW w:type="dxa" w:w="7580"/>
+            <w:tcBorders>
+              <w:top w:val="single" w:color="CBD5E1" w:sz="1"/>
+              <w:left w:val="single" w:color="CBD5E1" w:sz="1"/>
+              <w:bottom w:val="single" w:color="CBD5E1" w:sz="1"/>
+              <w:right w:val="single" w:color="CBD5E1" w:sz="1"/>
+            </w:tcBorders>
+            <w:tcMar>
+              <w:top w:type="dxa" w:w="80"/>
+              <w:left w:type="dxa" w:w="120"/>
+              <w:bottom w:type="dxa" w:w="80"/>
+              <w:right w:type="dxa" w:w="120"/>
+            </w:tcMar>
+          </w:tcPr>
+          <w:p>
+            <w:pPr>
+              <w:spacing w:after="140"/>
+            </w:pPr>
+            <w:r>
+              <w:rPr>
+                <w:rFonts w:ascii="Arial" w:cs="Arial" w:eastAsia="Arial" w:hAnsi="Arial"/>
+                <w:sz w:val="20"/>
+                <w:szCs w:val="20"/>
+              </w:rPr>
+              <w:t xml:space="preserve">ISO 9001:2015 §5.2</w:t>
+            </w:r>
+          </w:p>
+        </w:tc>
+      </w:tr>
+    </w:tbl>
     <w:p>
       <w:pPr>
         <w:spacing w:before="240" w:after="80"/>
@@ -205,6 +829,13 @@
         <w:t xml:space="preserve">Signed: _________________  |  Name: Dr. Stefan Gravesande  |  Date: 2026-05-08</w:t>
       </w:r>
     </w:p>
+    <w:sectPr>
+      <w:footerReference w:type="default" r:id="rId7"/>
+      <w:pgSz w:w="12240" w:h="15840" w:orient="portrait"/>
+      <w:pgMar w:top="1080" w:right="1080" w:bottom="1080" w:left="1080" w:header="708" w:footer="708" w:gutter="0"/>
+      <w:pgNumType/>
+      <w:docGrid w:linePitch="360"/>
+    </w:sectPr>
     <w:sectPr>
       <w:footerReference w:type="default" r:id="rId7"/>
       <w:pgSz w:w="12240" w:h="15840" w:orient="portrait"/>

</xml_diff>

<commit_message>
fix(ims): fix header extraction — case-sensitive PREQAL check, git baseline for headers
</commit_message>
<xml_diff>
--- a/public/ims/POL-01-Quality-Policy.docx
+++ b/public/ims/POL-01-Quality-Policy.docx
@@ -105,527 +105,6 @@
         </w:tc>
       </w:tr>
     </w:tbl>
-    <w:tbl>
-      <w:tblPr>
-        <w:tblW w:type="dxa" w:w="10080"/>
-        <w:tblBorders>
-          <w:top w:val="single" w:color="auto" w:sz="4"/>
-          <w:left w:val="single" w:color="auto" w:sz="4"/>
-          <w:bottom w:val="single" w:color="auto" w:sz="4"/>
-          <w:right w:val="single" w:color="auto" w:sz="4"/>
-          <w:insideH w:val="single" w:color="auto" w:sz="4"/>
-          <w:insideV w:val="single" w:color="auto" w:sz="4"/>
-        </w:tblBorders>
-      </w:tblPr>
-      <w:tblGrid>
-        <w:gridCol w:w="2000"/>
-        <w:gridCol w:w="8080"/>
-      </w:tblGrid>
-      <w:tr>
-        <w:tc>
-          <w:tcPr>
-            <w:tcW w:type="dxa" w:w="2000"/>
-            <w:tcBorders>
-              <w:top w:val="single" w:color="0F172A" w:sz="1"/>
-              <w:left w:val="single" w:color="0F172A" w:sz="1"/>
-              <w:bottom w:val="single" w:color="0F172A" w:sz="1"/>
-              <w:right w:val="single" w:color="0F172A" w:sz="1"/>
-            </w:tcBorders>
-            <w:shd w:fill="0F172A" w:val="clear"/>
-            <w:tcMar>
-              <w:top w:type="dxa" w:w="80"/>
-              <w:left w:type="dxa" w:w="120"/>
-              <w:bottom w:type="dxa" w:w="80"/>
-              <w:right w:type="dxa" w:w="120"/>
-            </w:tcMar>
-          </w:tcPr>
-          <w:p>
-            <w:pPr>
-              <w:spacing w:after="140"/>
-            </w:pPr>
-            <w:r>
-              <w:rPr>
-                <w:rFonts w:ascii="Arial" w:cs="Arial" w:eastAsia="Arial" w:hAnsi="Arial"/>
-                <w:b/>
-                <w:bCs/>
-                <w:color w:val="D97706"/>
-                <w:sz w:val="32"/>
-                <w:szCs w:val="32"/>
-              </w:rPr>
-              <w:t xml:space="preserve">PREQAL</w:t>
-            </w:r>
-          </w:p>
-        </w:tc>
-        <w:tc>
-          <w:tcPr>
-            <w:tcW w:type="dxa" w:w="8080"/>
-            <w:tcBorders>
-              <w:top w:val="single" w:color="0F172A" w:sz="1"/>
-              <w:left w:val="single" w:color="0F172A" w:sz="1"/>
-              <w:bottom w:val="single" w:color="0F172A" w:sz="1"/>
-              <w:right w:val="single" w:color="0F172A" w:sz="1"/>
-            </w:tcBorders>
-            <w:shd w:fill="0F172A" w:val="clear"/>
-            <w:tcMar>
-              <w:top w:type="dxa" w:w="80"/>
-              <w:left w:type="dxa" w:w="120"/>
-              <w:bottom w:type="dxa" w:w="80"/>
-              <w:right w:type="dxa" w:w="120"/>
-            </w:tcMar>
-          </w:tcPr>
-          <w:p>
-            <w:pPr>
-              <w:spacing w:after="140"/>
-            </w:pPr>
-            <w:r>
-              <w:rPr>
-                <w:rFonts w:ascii="Arial" w:cs="Arial" w:eastAsia="Arial" w:hAnsi="Arial"/>
-                <w:b/>
-                <w:bCs/>
-                <w:color w:val="D97706"/>
-                <w:sz w:val="18"/>
-                <w:szCs w:val="18"/>
-              </w:rPr>
-              <w:t xml:space="preserve">POL-01</w:t>
-            </w:r>
-          </w:p>
-          <w:p>
-            <w:pPr>
-              <w:spacing w:after="140"/>
-            </w:pPr>
-            <w:r>
-              <w:rPr>
-                <w:rFonts w:ascii="Arial" w:cs="Arial" w:eastAsia="Arial" w:hAnsi="Arial"/>
-                <w:b/>
-                <w:bCs/>
-                <w:color w:val="FFFFFF"/>
-                <w:sz w:val="28"/>
-                <w:szCs w:val="28"/>
-              </w:rPr>
-              <w:t xml:space="preserve">Quality Policy</w:t>
-            </w:r>
-          </w:p>
-        </w:tc>
-      </w:tr>
-    </w:tbl>
-    <w:p>
-      <w:pPr>
-        <w:spacing w:after="140"/>
-      </w:pPr>
-    </w:p>
-    <w:tbl>
-      <w:tblPr>
-        <w:tblW w:type="dxa" w:w="10080"/>
-        <w:tblBorders>
-          <w:top w:val="single" w:color="auto" w:sz="4"/>
-          <w:left w:val="single" w:color="auto" w:sz="4"/>
-          <w:bottom w:val="single" w:color="auto" w:sz="4"/>
-          <w:right w:val="single" w:color="auto" w:sz="4"/>
-          <w:insideH w:val="single" w:color="auto" w:sz="4"/>
-          <w:insideV w:val="single" w:color="auto" w:sz="4"/>
-        </w:tblBorders>
-      </w:tblPr>
-      <w:tblGrid>
-        <w:gridCol w:w="2500"/>
-        <w:gridCol w:w="7580"/>
-      </w:tblGrid>
-      <w:tr>
-        <w:tc>
-          <w:tcPr>
-            <w:tcW w:type="dxa" w:w="2500"/>
-            <w:tcBorders>
-              <w:top w:val="single" w:color="0F172A" w:sz="1"/>
-              <w:left w:val="single" w:color="0F172A" w:sz="1"/>
-              <w:bottom w:val="single" w:color="0F172A" w:sz="1"/>
-              <w:right w:val="single" w:color="0F172A" w:sz="1"/>
-            </w:tcBorders>
-            <w:shd w:fill="0F172A" w:val="clear"/>
-            <w:tcMar>
-              <w:top w:type="dxa" w:w="80"/>
-              <w:left w:type="dxa" w:w="120"/>
-              <w:bottom w:type="dxa" w:w="80"/>
-              <w:right w:type="dxa" w:w="120"/>
-            </w:tcMar>
-          </w:tcPr>
-          <w:p>
-            <w:pPr>
-              <w:spacing w:after="140"/>
-            </w:pPr>
-            <w:r>
-              <w:rPr>
-                <w:rFonts w:ascii="Arial" w:cs="Arial" w:eastAsia="Arial" w:hAnsi="Arial"/>
-                <w:b/>
-                <w:bCs/>
-                <w:color w:val="FFFFFF"/>
-                <w:sz w:val="20"/>
-                <w:szCs w:val="20"/>
-              </w:rPr>
-              <w:t xml:space="preserve">Document No</w:t>
-            </w:r>
-          </w:p>
-        </w:tc>
-        <w:tc>
-          <w:tcPr>
-            <w:tcW w:type="dxa" w:w="7580"/>
-            <w:tcBorders>
-              <w:top w:val="single" w:color="CBD5E1" w:sz="1"/>
-              <w:left w:val="single" w:color="CBD5E1" w:sz="1"/>
-              <w:bottom w:val="single" w:color="CBD5E1" w:sz="1"/>
-              <w:right w:val="single" w:color="CBD5E1" w:sz="1"/>
-            </w:tcBorders>
-            <w:tcMar>
-              <w:top w:type="dxa" w:w="80"/>
-              <w:left w:type="dxa" w:w="120"/>
-              <w:bottom w:type="dxa" w:w="80"/>
-              <w:right w:type="dxa" w:w="120"/>
-            </w:tcMar>
-          </w:tcPr>
-          <w:p>
-            <w:pPr>
-              <w:spacing w:after="140"/>
-            </w:pPr>
-            <w:r>
-              <w:rPr>
-                <w:rFonts w:ascii="Arial" w:cs="Arial" w:eastAsia="Arial" w:hAnsi="Arial"/>
-                <w:sz w:val="20"/>
-                <w:szCs w:val="20"/>
-              </w:rPr>
-              <w:t xml:space="preserve">POL-01</w:t>
-            </w:r>
-          </w:p>
-        </w:tc>
-      </w:tr>
-      <w:tr>
-        <w:tc>
-          <w:tcPr>
-            <w:tcW w:type="dxa" w:w="2500"/>
-            <w:tcBorders>
-              <w:top w:val="single" w:color="0F172A" w:sz="1"/>
-              <w:left w:val="single" w:color="0F172A" w:sz="1"/>
-              <w:bottom w:val="single" w:color="0F172A" w:sz="1"/>
-              <w:right w:val="single" w:color="0F172A" w:sz="1"/>
-            </w:tcBorders>
-            <w:shd w:fill="0F172A" w:val="clear"/>
-            <w:tcMar>
-              <w:top w:type="dxa" w:w="80"/>
-              <w:left w:type="dxa" w:w="120"/>
-              <w:bottom w:type="dxa" w:w="80"/>
-              <w:right w:type="dxa" w:w="120"/>
-            </w:tcMar>
-          </w:tcPr>
-          <w:p>
-            <w:pPr>
-              <w:spacing w:after="140"/>
-            </w:pPr>
-            <w:r>
-              <w:rPr>
-                <w:rFonts w:ascii="Arial" w:cs="Arial" w:eastAsia="Arial" w:hAnsi="Arial"/>
-                <w:b/>
-                <w:bCs/>
-                <w:color w:val="FFFFFF"/>
-                <w:sz w:val="20"/>
-                <w:szCs w:val="20"/>
-              </w:rPr>
-              <w:t xml:space="preserve">Version</w:t>
-            </w:r>
-          </w:p>
-        </w:tc>
-        <w:tc>
-          <w:tcPr>
-            <w:tcW w:type="dxa" w:w="7580"/>
-            <w:tcBorders>
-              <w:top w:val="single" w:color="CBD5E1" w:sz="1"/>
-              <w:left w:val="single" w:color="CBD5E1" w:sz="1"/>
-              <w:bottom w:val="single" w:color="CBD5E1" w:sz="1"/>
-              <w:right w:val="single" w:color="CBD5E1" w:sz="1"/>
-            </w:tcBorders>
-            <w:tcMar>
-              <w:top w:type="dxa" w:w="80"/>
-              <w:left w:type="dxa" w:w="120"/>
-              <w:bottom w:type="dxa" w:w="80"/>
-              <w:right w:type="dxa" w:w="120"/>
-            </w:tcMar>
-          </w:tcPr>
-          <w:p>
-            <w:pPr>
-              <w:spacing w:after="140"/>
-            </w:pPr>
-            <w:r>
-              <w:rPr>
-                <w:rFonts w:ascii="Arial" w:cs="Arial" w:eastAsia="Arial" w:hAnsi="Arial"/>
-                <w:sz w:val="20"/>
-                <w:szCs w:val="20"/>
-              </w:rPr>
-              <w:t xml:space="preserve">1.0</w:t>
-            </w:r>
-          </w:p>
-        </w:tc>
-      </w:tr>
-      <w:tr>
-        <w:tc>
-          <w:tcPr>
-            <w:tcW w:type="dxa" w:w="2500"/>
-            <w:tcBorders>
-              <w:top w:val="single" w:color="0F172A" w:sz="1"/>
-              <w:left w:val="single" w:color="0F172A" w:sz="1"/>
-              <w:bottom w:val="single" w:color="0F172A" w:sz="1"/>
-              <w:right w:val="single" w:color="0F172A" w:sz="1"/>
-            </w:tcBorders>
-            <w:shd w:fill="0F172A" w:val="clear"/>
-            <w:tcMar>
-              <w:top w:type="dxa" w:w="80"/>
-              <w:left w:type="dxa" w:w="120"/>
-              <w:bottom w:type="dxa" w:w="80"/>
-              <w:right w:type="dxa" w:w="120"/>
-            </w:tcMar>
-          </w:tcPr>
-          <w:p>
-            <w:pPr>
-              <w:spacing w:after="140"/>
-            </w:pPr>
-            <w:r>
-              <w:rPr>
-                <w:rFonts w:ascii="Arial" w:cs="Arial" w:eastAsia="Arial" w:hAnsi="Arial"/>
-                <w:b/>
-                <w:bCs/>
-                <w:color w:val="FFFFFF"/>
-                <w:sz w:val="20"/>
-                <w:szCs w:val="20"/>
-              </w:rPr>
-              <w:t xml:space="preserve">Effective Date</w:t>
-            </w:r>
-          </w:p>
-        </w:tc>
-        <w:tc>
-          <w:tcPr>
-            <w:tcW w:type="dxa" w:w="7580"/>
-            <w:tcBorders>
-              <w:top w:val="single" w:color="CBD5E1" w:sz="1"/>
-              <w:left w:val="single" w:color="CBD5E1" w:sz="1"/>
-              <w:bottom w:val="single" w:color="CBD5E1" w:sz="1"/>
-              <w:right w:val="single" w:color="CBD5E1" w:sz="1"/>
-            </w:tcBorders>
-            <w:tcMar>
-              <w:top w:type="dxa" w:w="80"/>
-              <w:left w:type="dxa" w:w="120"/>
-              <w:bottom w:type="dxa" w:w="80"/>
-              <w:right w:type="dxa" w:w="120"/>
-            </w:tcMar>
-          </w:tcPr>
-          <w:p>
-            <w:pPr>
-              <w:spacing w:after="140"/>
-            </w:pPr>
-            <w:r>
-              <w:rPr>
-                <w:rFonts w:ascii="Arial" w:cs="Arial" w:eastAsia="Arial" w:hAnsi="Arial"/>
-                <w:sz w:val="20"/>
-                <w:szCs w:val="20"/>
-              </w:rPr>
-              <w:t xml:space="preserve">2026-05-08</w:t>
-            </w:r>
-          </w:p>
-        </w:tc>
-      </w:tr>
-      <w:tr>
-        <w:tc>
-          <w:tcPr>
-            <w:tcW w:type="dxa" w:w="2500"/>
-            <w:tcBorders>
-              <w:top w:val="single" w:color="0F172A" w:sz="1"/>
-              <w:left w:val="single" w:color="0F172A" w:sz="1"/>
-              <w:bottom w:val="single" w:color="0F172A" w:sz="1"/>
-              <w:right w:val="single" w:color="0F172A" w:sz="1"/>
-            </w:tcBorders>
-            <w:shd w:fill="0F172A" w:val="clear"/>
-            <w:tcMar>
-              <w:top w:type="dxa" w:w="80"/>
-              <w:left w:type="dxa" w:w="120"/>
-              <w:bottom w:type="dxa" w:w="80"/>
-              <w:right w:type="dxa" w:w="120"/>
-            </w:tcMar>
-          </w:tcPr>
-          <w:p>
-            <w:pPr>
-              <w:spacing w:after="140"/>
-            </w:pPr>
-            <w:r>
-              <w:rPr>
-                <w:rFonts w:ascii="Arial" w:cs="Arial" w:eastAsia="Arial" w:hAnsi="Arial"/>
-                <w:b/>
-                <w:bCs/>
-                <w:color w:val="FFFFFF"/>
-                <w:sz w:val="20"/>
-                <w:szCs w:val="20"/>
-              </w:rPr>
-              <w:t xml:space="preserve">Owner</w:t>
-            </w:r>
-          </w:p>
-        </w:tc>
-        <w:tc>
-          <w:tcPr>
-            <w:tcW w:type="dxa" w:w="7580"/>
-            <w:tcBorders>
-              <w:top w:val="single" w:color="CBD5E1" w:sz="1"/>
-              <w:left w:val="single" w:color="CBD5E1" w:sz="1"/>
-              <w:bottom w:val="single" w:color="CBD5E1" w:sz="1"/>
-              <w:right w:val="single" w:color="CBD5E1" w:sz="1"/>
-            </w:tcBorders>
-            <w:tcMar>
-              <w:top w:type="dxa" w:w="80"/>
-              <w:left w:type="dxa" w:w="120"/>
-              <w:bottom w:type="dxa" w:w="80"/>
-              <w:right w:type="dxa" w:w="120"/>
-            </w:tcMar>
-          </w:tcPr>
-          <w:p>
-            <w:pPr>
-              <w:spacing w:after="140"/>
-            </w:pPr>
-            <w:r>
-              <w:rPr>
-                <w:rFonts w:ascii="Arial" w:cs="Arial" w:eastAsia="Arial" w:hAnsi="Arial"/>
-                <w:sz w:val="20"/>
-                <w:szCs w:val="20"/>
-              </w:rPr>
-              <w:t xml:space="preserve">Dr. Stefan Gravesande</w:t>
-            </w:r>
-          </w:p>
-        </w:tc>
-      </w:tr>
-      <w:tr>
-        <w:tc>
-          <w:tcPr>
-            <w:tcW w:type="dxa" w:w="2500"/>
-            <w:tcBorders>
-              <w:top w:val="single" w:color="0F172A" w:sz="1"/>
-              <w:left w:val="single" w:color="0F172A" w:sz="1"/>
-              <w:bottom w:val="single" w:color="0F172A" w:sz="1"/>
-              <w:right w:val="single" w:color="0F172A" w:sz="1"/>
-            </w:tcBorders>
-            <w:shd w:fill="0F172A" w:val="clear"/>
-            <w:tcMar>
-              <w:top w:type="dxa" w:w="80"/>
-              <w:left w:type="dxa" w:w="120"/>
-              <w:bottom w:type="dxa" w:w="80"/>
-              <w:right w:type="dxa" w:w="120"/>
-            </w:tcMar>
-          </w:tcPr>
-          <w:p>
-            <w:pPr>
-              <w:spacing w:after="140"/>
-            </w:pPr>
-            <w:r>
-              <w:rPr>
-                <w:rFonts w:ascii="Arial" w:cs="Arial" w:eastAsia="Arial" w:hAnsi="Arial"/>
-                <w:b/>
-                <w:bCs/>
-                <w:color w:val="FFFFFF"/>
-                <w:sz w:val="20"/>
-                <w:szCs w:val="20"/>
-              </w:rPr>
-              <w:t xml:space="preserve">Review Date</w:t>
-            </w:r>
-          </w:p>
-        </w:tc>
-        <w:tc>
-          <w:tcPr>
-            <w:tcW w:type="dxa" w:w="7580"/>
-            <w:tcBorders>
-              <w:top w:val="single" w:color="CBD5E1" w:sz="1"/>
-              <w:left w:val="single" w:color="CBD5E1" w:sz="1"/>
-              <w:bottom w:val="single" w:color="CBD5E1" w:sz="1"/>
-              <w:right w:val="single" w:color="CBD5E1" w:sz="1"/>
-            </w:tcBorders>
-            <w:tcMar>
-              <w:top w:type="dxa" w:w="80"/>
-              <w:left w:type="dxa" w:w="120"/>
-              <w:bottom w:type="dxa" w:w="80"/>
-              <w:right w:type="dxa" w:w="120"/>
-            </w:tcMar>
-          </w:tcPr>
-          <w:p>
-            <w:pPr>
-              <w:spacing w:after="140"/>
-            </w:pPr>
-            <w:r>
-              <w:rPr>
-                <w:rFonts w:ascii="Arial" w:cs="Arial" w:eastAsia="Arial" w:hAnsi="Arial"/>
-                <w:sz w:val="20"/>
-                <w:szCs w:val="20"/>
-              </w:rPr>
-              <w:t xml:space="preserve">2027-05-08</w:t>
-            </w:r>
-          </w:p>
-        </w:tc>
-      </w:tr>
-      <w:tr>
-        <w:tc>
-          <w:tcPr>
-            <w:tcW w:type="dxa" w:w="2500"/>
-            <w:tcBorders>
-              <w:top w:val="single" w:color="0F172A" w:sz="1"/>
-              <w:left w:val="single" w:color="0F172A" w:sz="1"/>
-              <w:bottom w:val="single" w:color="0F172A" w:sz="1"/>
-              <w:right w:val="single" w:color="0F172A" w:sz="1"/>
-            </w:tcBorders>
-            <w:shd w:fill="0F172A" w:val="clear"/>
-            <w:tcMar>
-              <w:top w:type="dxa" w:w="80"/>
-              <w:left w:type="dxa" w:w="120"/>
-              <w:bottom w:type="dxa" w:w="80"/>
-              <w:right w:type="dxa" w:w="120"/>
-            </w:tcMar>
-          </w:tcPr>
-          <w:p>
-            <w:pPr>
-              <w:spacing w:after="140"/>
-            </w:pPr>
-            <w:r>
-              <w:rPr>
-                <w:rFonts w:ascii="Arial" w:cs="Arial" w:eastAsia="Arial" w:hAnsi="Arial"/>
-                <w:b/>
-                <w:bCs/>
-                <w:color w:val="FFFFFF"/>
-                <w:sz w:val="20"/>
-                <w:szCs w:val="20"/>
-              </w:rPr>
-              <w:t xml:space="preserve">ISO Reference</w:t>
-            </w:r>
-          </w:p>
-        </w:tc>
-        <w:tc>
-          <w:tcPr>
-            <w:tcW w:type="dxa" w:w="7580"/>
-            <w:tcBorders>
-              <w:top w:val="single" w:color="CBD5E1" w:sz="1"/>
-              <w:left w:val="single" w:color="CBD5E1" w:sz="1"/>
-              <w:bottom w:val="single" w:color="CBD5E1" w:sz="1"/>
-              <w:right w:val="single" w:color="CBD5E1" w:sz="1"/>
-            </w:tcBorders>
-            <w:tcMar>
-              <w:top w:type="dxa" w:w="80"/>
-              <w:left w:type="dxa" w:w="120"/>
-              <w:bottom w:type="dxa" w:w="80"/>
-              <w:right w:type="dxa" w:w="120"/>
-            </w:tcMar>
-          </w:tcPr>
-          <w:p>
-            <w:pPr>
-              <w:spacing w:after="140"/>
-            </w:pPr>
-            <w:r>
-              <w:rPr>
-                <w:rFonts w:ascii="Arial" w:cs="Arial" w:eastAsia="Arial" w:hAnsi="Arial"/>
-                <w:sz w:val="20"/>
-                <w:szCs w:val="20"/>
-              </w:rPr>
-              <w:t xml:space="preserve">ISO 9001:2015 §5.2</w:t>
-            </w:r>
-          </w:p>
-        </w:tc>
-      </w:tr>
-    </w:tbl>
     <w:p>
       <w:pPr>
         <w:spacing w:before="240" w:after="80"/>
@@ -829,13 +308,6 @@
         <w:t xml:space="preserve">Signed: _________________  |  Name: Dr. Stefan Gravesande  |  Date: 2026-05-08</w:t>
       </w:r>
     </w:p>
-    <w:sectPr>
-      <w:footerReference w:type="default" r:id="rId7"/>
-      <w:pgSz w:w="12240" w:h="15840" w:orient="portrait"/>
-      <w:pgMar w:top="1080" w:right="1080" w:bottom="1080" w:left="1080" w:header="708" w:footer="708" w:gutter="0"/>
-      <w:pgNumType/>
-      <w:docGrid w:linePitch="360"/>
-    </w:sectPr>
     <w:sectPr>
       <w:footerReference w:type="default" r:id="rId7"/>
       <w:pgSz w:w="12240" w:h="15840" w:orient="portrait"/>

</xml_diff>

<commit_message>
fix(ims): apply 1.5 line spacing and no-split formatting to all POL/PRO docs
</commit_message>
<xml_diff>
--- a/public/ims/POL-01-Quality-Policy.docx
+++ b/public/ims/POL-01-Quality-Policy.docx
@@ -107,10 +107,12 @@
     </w:tbl>
     <w:p>
       <w:pPr>
-        <w:spacing w:before="240" w:after="80"/>
-      </w:pPr>
-      <w:r>
-        <w:rPr>
+        <w:spacing w:line="360" w:lineRule="auto" w:before="240" w:after="80"/>
+        <w:keepLines/>
+      </w:pPr>
+      <w:r>
+        <w:rPr>
+          <w:rFonts w:ascii="Times New Roman" w:hAnsi="Times New Roman" w:cs="Times New Roman"/>
           <w:b/>
           <w:bCs/>
           <w:sz w:val="28"/>
@@ -122,18 +124,26 @@
     </w:p>
     <w:p>
       <w:pPr>
-        <w:spacing w:after="80"/>
-      </w:pPr>
-      <w:r>
+        <w:spacing w:line="360" w:lineRule="auto" w:after="80"/>
+        <w:keepLines/>
+      </w:pPr>
+      <w:r>
+        <w:rPr>
+          <w:rFonts w:ascii="Times New Roman" w:hAnsi="Times New Roman" w:cs="Times New Roman"/>
+          <w:sz w:val="24"/>
+          <w:szCs w:val="24"/>
+        </w:rPr>
         <w:t xml:space="preserve">Preqal exists to help organizations in the agri-foods, poultry, and eco-hospitality sectors build management systems that actually work — systems that protect people, satisfy customers, and drive measurable improvements.</w:t>
       </w:r>
     </w:p>
     <w:p>
       <w:pPr>
-        <w:spacing w:before="240" w:after="80"/>
-      </w:pPr>
-      <w:r>
-        <w:rPr>
+        <w:spacing w:line="360" w:lineRule="auto" w:before="240" w:after="80"/>
+        <w:keepLines/>
+      </w:pPr>
+      <w:r>
+        <w:rPr>
+          <w:rFonts w:ascii="Times New Roman" w:hAnsi="Times New Roman" w:cs="Times New Roman"/>
           <w:b/>
           <w:bCs/>
           <w:sz w:val="28"/>
@@ -145,58 +155,96 @@
     </w:p>
     <w:p>
       <w:pPr>
-        <w:spacing w:after="80"/>
-      </w:pPr>
-      <w:r>
+        <w:spacing w:line="360" w:lineRule="auto" w:after="80"/>
+        <w:keepLines/>
+      </w:pPr>
+      <w:r>
+        <w:rPr>
+          <w:rFonts w:ascii="Times New Roman" w:hAnsi="Times New Roman" w:cs="Times New Roman"/>
+          <w:sz w:val="24"/>
+          <w:szCs w:val="24"/>
+        </w:rPr>
         <w:t xml:space="preserve">Preqal is fully committed to:</w:t>
       </w:r>
     </w:p>
     <w:p>
       <w:pPr>
-        <w:spacing w:after="80"/>
-      </w:pPr>
-      <w:r>
+        <w:spacing w:line="360" w:lineRule="auto" w:after="80"/>
+        <w:keepLines/>
+      </w:pPr>
+      <w:r>
+        <w:rPr>
+          <w:rFonts w:ascii="Times New Roman" w:hAnsi="Times New Roman" w:cs="Times New Roman"/>
+          <w:sz w:val="24"/>
+          <w:szCs w:val="24"/>
+        </w:rPr>
         <w:t xml:space="preserve">a) Delivering services that fully meet or exceed the requirements agreed with each client.</w:t>
       </w:r>
     </w:p>
     <w:p>
       <w:pPr>
-        <w:spacing w:after="80"/>
-      </w:pPr>
-      <w:r>
+        <w:spacing w:line="360" w:lineRule="auto" w:after="80"/>
+        <w:keepLines/>
+      </w:pPr>
+      <w:r>
+        <w:rPr>
+          <w:rFonts w:ascii="Times New Roman" w:hAnsi="Times New Roman" w:cs="Times New Roman"/>
+          <w:sz w:val="24"/>
+          <w:szCs w:val="24"/>
+        </w:rPr>
         <w:t xml:space="preserve">b) Applying ISO 9001:2015 and related standards with rigour, accuracy, and integrity.</w:t>
       </w:r>
     </w:p>
     <w:p>
       <w:pPr>
-        <w:spacing w:after="80"/>
-      </w:pPr>
-      <w:r>
+        <w:spacing w:line="360" w:lineRule="auto" w:after="80"/>
+        <w:keepLines/>
+      </w:pPr>
+      <w:r>
+        <w:rPr>
+          <w:rFonts w:ascii="Times New Roman" w:hAnsi="Times New Roman" w:cs="Times New Roman"/>
+          <w:sz w:val="24"/>
+          <w:szCs w:val="24"/>
+        </w:rPr>
         <w:t xml:space="preserve">c) Maintaining a culture of continual improvement in all our processes, tools, and outputs.</w:t>
       </w:r>
     </w:p>
     <w:p>
       <w:pPr>
-        <w:spacing w:after="80"/>
-      </w:pPr>
-      <w:r>
+        <w:spacing w:line="360" w:lineRule="auto" w:after="80"/>
+        <w:keepLines/>
+      </w:pPr>
+      <w:r>
+        <w:rPr>
+          <w:rFonts w:ascii="Times New Roman" w:hAnsi="Times New Roman" w:cs="Times New Roman"/>
+          <w:sz w:val="24"/>
+          <w:szCs w:val="24"/>
+        </w:rPr>
         <w:t xml:space="preserve">d) Meeting applicable statutory and regulatory requirements in all jurisdictions we operate.</w:t>
       </w:r>
     </w:p>
     <w:p>
       <w:pPr>
-        <w:spacing w:after="80"/>
-      </w:pPr>
-      <w:r>
+        <w:spacing w:line="360" w:lineRule="auto" w:after="80"/>
+        <w:keepLines/>
+      </w:pPr>
+      <w:r>
+        <w:rPr>
+          <w:rFonts w:ascii="Times New Roman" w:hAnsi="Times New Roman" w:cs="Times New Roman"/>
+          <w:sz w:val="24"/>
+          <w:szCs w:val="24"/>
+        </w:rPr>
         <w:t xml:space="preserve">e) Setting measurable quality objectives and reviewing them regularly to ensure they remain relevant and achievable.</w:t>
       </w:r>
     </w:p>
     <w:p>
       <w:pPr>
-        <w:spacing w:before="240" w:after="80"/>
-      </w:pPr>
-      <w:r>
-        <w:rPr>
+        <w:spacing w:line="360" w:lineRule="auto" w:before="240" w:after="80"/>
+        <w:keepLines/>
+      </w:pPr>
+      <w:r>
+        <w:rPr>
+          <w:rFonts w:ascii="Times New Roman" w:hAnsi="Times New Roman" w:cs="Times New Roman"/>
           <w:b/>
           <w:bCs/>
           <w:sz w:val="28"/>
@@ -208,58 +256,96 @@
     </w:p>
     <w:p>
       <w:pPr>
-        <w:spacing w:after="80"/>
-      </w:pPr>
-      <w:r>
+        <w:spacing w:line="360" w:lineRule="auto" w:after="80"/>
+        <w:keepLines/>
+      </w:pPr>
+      <w:r>
+        <w:rPr>
+          <w:rFonts w:ascii="Times New Roman" w:hAnsi="Times New Roman" w:cs="Times New Roman"/>
+          <w:sz w:val="24"/>
+          <w:szCs w:val="24"/>
+        </w:rPr>
         <w:t xml:space="preserve">Preqal's current quality objectives include:</w:t>
       </w:r>
     </w:p>
     <w:p>
       <w:pPr>
-        <w:spacing w:after="80"/>
-      </w:pPr>
-      <w:r>
+        <w:spacing w:line="360" w:lineRule="auto" w:after="80"/>
+        <w:keepLines/>
+      </w:pPr>
+      <w:r>
+        <w:rPr>
+          <w:rFonts w:ascii="Times New Roman" w:hAnsi="Times New Roman" w:cs="Times New Roman"/>
+          <w:sz w:val="24"/>
+          <w:szCs w:val="24"/>
+        </w:rPr>
         <w:t xml:space="preserve">  • 100% of proposals delivered within 48 hours of lead qualification (SOP-03)</w:t>
       </w:r>
     </w:p>
     <w:p>
       <w:pPr>
-        <w:spacing w:after="80"/>
-      </w:pPr>
-      <w:r>
+        <w:spacing w:line="360" w:lineRule="auto" w:after="80"/>
+        <w:keepLines/>
+      </w:pPr>
+      <w:r>
+        <w:rPr>
+          <w:rFonts w:ascii="Times New Roman" w:hAnsi="Times New Roman" w:cs="Times New Roman"/>
+          <w:sz w:val="24"/>
+          <w:szCs w:val="24"/>
+        </w:rPr>
         <w:t xml:space="preserve">  • Average client NPS score ≥ 8 (SOP-07)</w:t>
       </w:r>
     </w:p>
     <w:p>
       <w:pPr>
-        <w:spacing w:after="80"/>
-      </w:pPr>
-      <w:r>
+        <w:spacing w:line="360" w:lineRule="auto" w:after="80"/>
+        <w:keepLines/>
+      </w:pPr>
+      <w:r>
+        <w:rPr>
+          <w:rFonts w:ascii="Times New Roman" w:hAnsi="Times New Roman" w:cs="Times New Roman"/>
+          <w:sz w:val="24"/>
+          <w:szCs w:val="24"/>
+        </w:rPr>
         <w:t xml:space="preserve">  • 100% of invoices issued within 24 hours of trigger event (SOP-08)</w:t>
       </w:r>
     </w:p>
     <w:p>
       <w:pPr>
-        <w:spacing w:after="80"/>
-      </w:pPr>
-      <w:r>
+        <w:spacing w:line="360" w:lineRule="auto" w:after="80"/>
+        <w:keepLines/>
+      </w:pPr>
+      <w:r>
+        <w:rPr>
+          <w:rFonts w:ascii="Times New Roman" w:hAnsi="Times New Roman" w:cs="Times New Roman"/>
+          <w:sz w:val="24"/>
+          <w:szCs w:val="24"/>
+        </w:rPr>
         <w:t xml:space="preserve">  • Client renewal rate ≥ 60% (SOP-09)</w:t>
       </w:r>
     </w:p>
     <w:p>
       <w:pPr>
-        <w:spacing w:after="80"/>
-      </w:pPr>
-      <w:r>
+        <w:spacing w:line="360" w:lineRule="auto" w:after="80"/>
+        <w:keepLines/>
+      </w:pPr>
+      <w:r>
+        <w:rPr>
+          <w:rFonts w:ascii="Times New Roman" w:hAnsi="Times New Roman" w:cs="Times New Roman"/>
+          <w:sz w:val="24"/>
+          <w:szCs w:val="24"/>
+        </w:rPr>
         <w:t xml:space="preserve">These objectives are reviewed at each annual management review.</w:t>
       </w:r>
     </w:p>
     <w:p>
       <w:pPr>
-        <w:spacing w:before="240" w:after="80"/>
-      </w:pPr>
-      <w:r>
-        <w:rPr>
+        <w:spacing w:line="360" w:lineRule="auto" w:before="240" w:after="80"/>
+        <w:keepLines/>
+      </w:pPr>
+      <w:r>
+        <w:rPr>
+          <w:rFonts w:ascii="Times New Roman" w:hAnsi="Times New Roman" w:cs="Times New Roman"/>
           <w:b/>
           <w:bCs/>
           <w:sz w:val="28"/>
@@ -271,18 +357,26 @@
     </w:p>
     <w:p>
       <w:pPr>
-        <w:spacing w:after="80"/>
-      </w:pPr>
-      <w:r>
+        <w:spacing w:line="360" w:lineRule="auto" w:after="80"/>
+        <w:keepLines/>
+      </w:pPr>
+      <w:r>
+        <w:rPr>
+          <w:rFonts w:ascii="Times New Roman" w:hAnsi="Times New Roman" w:cs="Times New Roman"/>
+          <w:sz w:val="24"/>
+          <w:szCs w:val="24"/>
+        </w:rPr>
         <w:t xml:space="preserve">Dr. Stefan Gravesande, as Managing Director, is personally responsible for establishing, maintaining, and communicating this Quality Policy. All workers — human and agentic — are expected to understand and apply this policy in their roles.</w:t>
       </w:r>
     </w:p>
     <w:p>
       <w:pPr>
-        <w:spacing w:before="240" w:after="80"/>
-      </w:pPr>
-      <w:r>
-        <w:rPr>
+        <w:spacing w:line="360" w:lineRule="auto" w:before="240" w:after="80"/>
+        <w:keepLines/>
+      </w:pPr>
+      <w:r>
+        <w:rPr>
+          <w:rFonts w:ascii="Times New Roman" w:hAnsi="Times New Roman" w:cs="Times New Roman"/>
           <w:b/>
           <w:bCs/>
           <w:sz w:val="28"/>
@@ -294,17 +388,29 @@
     </w:p>
     <w:p>
       <w:pPr>
-        <w:spacing w:after="80"/>
-      </w:pPr>
-      <w:r>
+        <w:spacing w:line="360" w:lineRule="auto" w:after="80"/>
+        <w:keepLines/>
+      </w:pPr>
+      <w:r>
+        <w:rPr>
+          <w:rFonts w:ascii="Times New Roman" w:hAnsi="Times New Roman" w:cs="Times New Roman"/>
+          <w:sz w:val="24"/>
+          <w:szCs w:val="24"/>
+        </w:rPr>
         <w:t xml:space="preserve">This policy is available to all relevant parties at preqal.org and through the Preqal QMS document pack. It is reviewed annually and updated whenever the strategic context changes.</w:t>
       </w:r>
     </w:p>
     <w:p>
       <w:pPr>
-        <w:spacing w:after="80"/>
-      </w:pPr>
-      <w:r>
+        <w:spacing w:line="360" w:lineRule="auto" w:after="80"/>
+        <w:keepLines/>
+      </w:pPr>
+      <w:r>
+        <w:rPr>
+          <w:rFonts w:ascii="Times New Roman" w:hAnsi="Times New Roman" w:cs="Times New Roman"/>
+          <w:sz w:val="24"/>
+          <w:szCs w:val="24"/>
+        </w:rPr>
         <w:t xml:space="preserve">Signed: _________________  |  Name: Dr. Stefan Gravesande  |  Date: 2026-05-08</w:t>
       </w:r>
     </w:p>

</xml_diff>

<commit_message>
feat(ims): branded cover page with favicon+wordmark and favicon in page header
</commit_message>
<xml_diff>
--- a/public/ims/POL-01-Quality-Policy.docx
+++ b/public/ims/POL-01-Quality-Policy.docx
@@ -2,109 +2,147 @@
 <file path=word/document.xml><?xml version="1.0" encoding="utf-8"?>
 <w:document xmlns:wpc="http://schemas.microsoft.com/office/word/2010/wordprocessingCanvas" xmlns:mc="http://schemas.openxmlformats.org/markup-compatibility/2006" xmlns:o="urn:schemas-microsoft-com:office:office" xmlns:r="http://schemas.openxmlformats.org/officeDocument/2006/relationships" xmlns:m="http://schemas.openxmlformats.org/officeDocument/2006/math" xmlns:v="urn:schemas-microsoft-com:vml" xmlns:wp14="http://schemas.microsoft.com/office/word/2010/wordprocessingDrawing" xmlns:wp="http://schemas.openxmlformats.org/drawingml/2006/wordprocessingDrawing" xmlns:w10="urn:schemas-microsoft-com:office:word" xmlns:w="http://schemas.openxmlformats.org/wordprocessingml/2006/main" xmlns:w14="http://schemas.microsoft.com/office/word/2010/wordml" xmlns:w15="http://schemas.microsoft.com/office/word/2012/wordml" xmlns:wpg="http://schemas.microsoft.com/office/word/2010/wordprocessingGroup" xmlns:wpi="http://schemas.microsoft.com/office/word/2010/wordprocessingInk" xmlns:wne="http://schemas.microsoft.com/office/word/2006/wordml" xmlns:wps="http://schemas.microsoft.com/office/word/2010/wordprocessingShape" xmlns:cx="http://schemas.microsoft.com/office/drawing/2014/chartex" xmlns:cx1="http://schemas.microsoft.com/office/drawing/2015/9/8/chartex" xmlns:cx2="http://schemas.microsoft.com/office/drawing/2015/10/21/chartex" xmlns:cx3="http://schemas.microsoft.com/office/drawing/2016/5/9/chartex" xmlns:cx4="http://schemas.microsoft.com/office/drawing/2016/5/10/chartex" xmlns:cx5="http://schemas.microsoft.com/office/drawing/2016/5/11/chartex" xmlns:cx6="http://schemas.microsoft.com/office/drawing/2016/5/12/chartex" xmlns:cx7="http://schemas.microsoft.com/office/drawing/2016/5/13/chartex" xmlns:cx8="http://schemas.microsoft.com/office/drawing/2016/5/14/chartex" xmlns:aink="http://schemas.microsoft.com/office/drawing/2016/ink" xmlns:am3d="http://schemas.microsoft.com/office/drawing/2017/model3d" xmlns:w16cex="http://schemas.microsoft.com/office/word/2018/wordml/cex" xmlns:w16cid="http://schemas.microsoft.com/office/word/2016/wordml/cid" xmlns:w16="http://schemas.microsoft.com/office/word/2018/wordml" xmlns:w16sdtdh="http://schemas.microsoft.com/office/word/2020/wordml/sdtdatahash" xmlns:w16se="http://schemas.microsoft.com/office/word/2015/wordml/symex" mc:Ignorable="w14 w15 wp14">
   <w:body>
-    <w:tbl>
-      <w:tblPr>
-        <w:tblW w:type="dxa" w:w="10080"/>
-        <w:tblBorders>
-          <w:top w:val="single" w:color="auto" w:sz="4"/>
-          <w:left w:val="single" w:color="auto" w:sz="4"/>
-          <w:bottom w:val="single" w:color="auto" w:sz="4"/>
-          <w:right w:val="single" w:color="auto" w:sz="4"/>
-          <w:insideH w:val="single" w:color="auto" w:sz="4"/>
-          <w:insideV w:val="single" w:color="auto" w:sz="4"/>
-        </w:tblBorders>
-      </w:tblPr>
-      <w:tblGrid>
-        <w:gridCol w:w="2000"/>
-        <w:gridCol w:w="8080"/>
-      </w:tblGrid>
-      <w:tr>
-        <w:tc>
-          <w:tcPr>
-            <w:tcW w:type="dxa" w:w="2000"/>
-            <w:tcBorders>
-              <w:top w:val="single" w:color="0F172A" w:sz="1"/>
-              <w:left w:val="single" w:color="0F172A" w:sz="1"/>
-              <w:bottom w:val="single" w:color="0F172A" w:sz="1"/>
-              <w:right w:val="single" w:color="0F172A" w:sz="1"/>
-            </w:tcBorders>
-            <w:shd w:fill="0F172A" w:val="clear"/>
-            <w:tcMar>
-              <w:top w:type="dxa" w:w="80"/>
-              <w:left w:type="dxa" w:w="120"/>
-              <w:bottom w:type="dxa" w:w="80"/>
-              <w:right w:type="dxa" w:w="120"/>
-            </w:tcMar>
-          </w:tcPr>
-          <w:p>
-            <w:pPr>
-              <w:spacing w:after="140"/>
-            </w:pPr>
-            <w:r>
-              <w:rPr>
-                <w:rFonts w:ascii="Arial" w:cs="Arial" w:eastAsia="Arial" w:hAnsi="Arial"/>
-                <w:b/>
-                <w:bCs/>
-                <w:color w:val="D97706"/>
-                <w:sz w:val="32"/>
-                <w:szCs w:val="32"/>
-              </w:rPr>
-              <w:t xml:space="preserve">PREQAL</w:t>
-            </w:r>
-          </w:p>
-        </w:tc>
-        <w:tc>
-          <w:tcPr>
-            <w:tcW w:type="dxa" w:w="8080"/>
-            <w:tcBorders>
-              <w:top w:val="single" w:color="0F172A" w:sz="1"/>
-              <w:left w:val="single" w:color="0F172A" w:sz="1"/>
-              <w:bottom w:val="single" w:color="0F172A" w:sz="1"/>
-              <w:right w:val="single" w:color="0F172A" w:sz="1"/>
-            </w:tcBorders>
-            <w:shd w:fill="0F172A" w:val="clear"/>
-            <w:tcMar>
-              <w:top w:type="dxa" w:w="80"/>
-              <w:left w:type="dxa" w:w="120"/>
-              <w:bottom w:type="dxa" w:w="80"/>
-              <w:right w:type="dxa" w:w="120"/>
-            </w:tcMar>
-          </w:tcPr>
-          <w:p>
-            <w:pPr>
-              <w:spacing w:after="140"/>
-            </w:pPr>
-            <w:r>
-              <w:rPr>
-                <w:rFonts w:ascii="Arial" w:cs="Arial" w:eastAsia="Arial" w:hAnsi="Arial"/>
-                <w:b/>
-                <w:bCs/>
-                <w:color w:val="D97706"/>
-                <w:sz w:val="18"/>
-                <w:szCs w:val="18"/>
-              </w:rPr>
-              <w:t xml:space="preserve">POL-01</w:t>
-            </w:r>
-          </w:p>
-          <w:p>
-            <w:pPr>
-              <w:spacing w:after="140"/>
-            </w:pPr>
-            <w:r>
-              <w:rPr>
-                <w:rFonts w:ascii="Arial" w:cs="Arial" w:eastAsia="Arial" w:hAnsi="Arial"/>
-                <w:b/>
-                <w:bCs/>
-                <w:color w:val="FFFFFF"/>
-                <w:sz w:val="28"/>
-                <w:szCs w:val="28"/>
-              </w:rPr>
-              <w:t xml:space="preserve">jurisdictions Policy</w:t>
-            </w:r>
-          </w:p>
-        </w:tc>
-      </w:tr>
-    </w:tbl>
+    <w:p>
+      <w:pPr>
+        <w:shd w:fill="0F172A" w:val="clear"/>
+        <w:spacing w:after="140" w:before="140"/>
+        <w:ind w:left="200"/>
+      </w:pPr>
+      <w:r>
+        <w:rPr>
+          <w:rFonts w:ascii="Arial" w:cs="Arial" w:eastAsia="Arial" w:hAnsi="Arial"/>
+          <w:b/>
+          <w:bCs/>
+          <w:color w:val="FFFFFF"/>
+          <w:sz w:val="22"/>
+          <w:szCs w:val="22"/>
+        </w:rPr>
+        <w:t xml:space="preserve">PREQAL INTEGRATED MANAGEMENT SYSTEM  ·  Controlled Document — Internal Use Only</w:t>
+      </w:r>
+    </w:p>
+    <w:p>
+      <w:pPr>
+        <w:spacing w:after="0" w:before="480"/>
+      </w:pPr>
+    </w:p>
+    <w:p>
+      <w:pPr>
+        <w:jc w:val="center"/>
+        <w:spacing w:after="100" w:before="0"/>
+      </w:pPr>
+      <w:r>
+        <w:drawing>
+          <wp:inline xmlns:wp="http://schemas.openxmlformats.org/drawingml/2006/wordprocessingDrawing" distT="0" distB="0" distL="0" distR="0">
+            <wp:extent cx="1238250" cy="1390650"/>
+            <wp:effectExtent l="0" t="0" r="0" b="0"/>
+            <wp:docPr id="9" name="favicon"/>
+            <wp:cNvGraphicFramePr>
+              <a:graphicFrameLocks xmlns:a="http://schemas.openxmlformats.org/drawingml/2006/main" noChangeAspect="1"/>
+            </wp:cNvGraphicFramePr>
+            <a:graphic xmlns:a="http://schemas.openxmlformats.org/drawingml/2006/main">
+              <a:graphicData uri="http://schemas.openxmlformats.org/drawingml/2006/picture">
+                <pic:pic xmlns:pic="http://schemas.openxmlformats.org/drawingml/2006/picture">
+                  <pic:nvPicPr>
+                    <pic:cNvPr id="9" name="favicon"/>
+                    <pic:cNvPicPr/>
+                  </pic:nvPicPr>
+                  <pic:blipFill>
+                    <a:blip r:embed="rId9"/>
+                    <a:stretch>
+                      <a:fillRect/>
+                    </a:stretch>
+                  </pic:blipFill>
+                  <pic:spPr>
+                    <a:xfrm>
+                      <a:off x="0" y="0"/>
+                      <a:ext cx="1238250" cy="1390650"/>
+                    </a:xfrm>
+                    <a:prstGeom prst="rect">
+                      <a:avLst/>
+                    </a:prstGeom>
+                  </pic:spPr>
+                </pic:pic>
+              </a:graphicData>
+            </a:graphic>
+          </wp:inline>
+        </w:drawing>
+      </w:r>
+    </w:p>
+    <w:p>
+      <w:pPr>
+        <w:jc w:val="center"/>
+        <w:spacing w:after="400" w:before="0"/>
+      </w:pPr>
+      <w:r>
+        <w:drawing>
+          <wp:inline xmlns:wp="http://schemas.openxmlformats.org/drawingml/2006/wordprocessingDrawing" distT="0" distB="0" distL="0" distR="0">
+            <wp:extent cx="2095500" cy="914400"/>
+            <wp:effectExtent l="0" t="0" r="0" b="0"/>
+            <wp:docPr id="10" name="wordmark"/>
+            <wp:cNvGraphicFramePr>
+              <a:graphicFrameLocks xmlns:a="http://schemas.openxmlformats.org/drawingml/2006/main" noChangeAspect="1"/>
+            </wp:cNvGraphicFramePr>
+            <a:graphic xmlns:a="http://schemas.openxmlformats.org/drawingml/2006/main">
+              <a:graphicData uri="http://schemas.openxmlformats.org/drawingml/2006/picture">
+                <pic:pic xmlns:pic="http://schemas.openxmlformats.org/drawingml/2006/picture">
+                  <pic:nvPicPr>
+                    <pic:cNvPr id="10" name="wordmark"/>
+                    <pic:cNvPicPr/>
+                  </pic:nvPicPr>
+                  <pic:blipFill>
+                    <a:blip r:embed="rId10"/>
+                    <a:stretch>
+                      <a:fillRect/>
+                    </a:stretch>
+                  </pic:blipFill>
+                  <pic:spPr>
+                    <a:xfrm>
+                      <a:off x="0" y="0"/>
+                      <a:ext cx="2095500" cy="914400"/>
+                    </a:xfrm>
+                    <a:prstGeom prst="rect">
+                      <a:avLst/>
+                    </a:prstGeom>
+                  </pic:spPr>
+                </pic:pic>
+              </a:graphicData>
+            </a:graphic>
+          </wp:inline>
+        </w:drawing>
+      </w:r>
+    </w:p>
+    <w:p>
+      <w:pPr>
+        <w:jc w:val="center"/>
+        <w:spacing w:after="60" w:before="0"/>
+      </w:pPr>
+      <w:r>
+        <w:rPr>
+          <w:rFonts w:ascii="Arial" w:cs="Arial" w:eastAsia="Arial" w:hAnsi="Arial"/>
+          <w:b/>
+          <w:bCs/>
+          <w:color w:val="0F172A"/>
+          <w:sz w:val="44"/>
+          <w:szCs w:val="44"/>
+        </w:rPr>
+        <w:t xml:space="preserve">POL-01: Quality Policy</w:t>
+      </w:r>
+    </w:p>
+    <w:p>
+      <w:pPr>
+        <w:jc w:val="center"/>
+        <w:spacing w:after="320" w:before="0"/>
+      </w:pPr>
+      <w:r>
+        <w:rPr>
+          <w:rFonts w:ascii="Arial" w:cs="Arial" w:eastAsia="Arial" w:hAnsi="Arial"/>
+          <w:color w:val="64748B"/>
+          <w:sz w:val="24"/>
+          <w:szCs w:val="24"/>
+        </w:rPr>
+        <w:t xml:space="preserve">Policy</w:t>
+      </w:r>
+    </w:p>
     <w:p>
       <w:pPr>
         <w:spacing w:line="360" w:lineRule="auto" w:before="240" w:after="80"/>
@@ -551,6 +589,113 @@
     </w:p>
   </w:footnote>
 </w:footnotes>
+</file>
+
+<file path=word/header1.xml><?xml version="1.0" encoding="utf-8"?>
+<w:hdr xmlns:wpc="http://schemas.microsoft.com/office/word/2010/wordprocessingCanvas" xmlns:mc="http://schemas.openxmlformats.org/markup-compatibility/2006" xmlns:o="urn:schemas-microsoft-com:office:office" xmlns:r="http://schemas.openxmlformats.org/officeDocument/2006/relationships" xmlns:m="http://schemas.openxmlformats.org/officeDocument/2006/math" xmlns:v="urn:schemas-microsoft-com:vml" xmlns:wp14="http://schemas.microsoft.com/office/word/2010/wordprocessingDrawing" xmlns:wp="http://schemas.openxmlformats.org/drawingml/2006/wordprocessingDrawing" xmlns:w10="urn:schemas-microsoft-com:office:word" xmlns:w="http://schemas.openxmlformats.org/wordprocessingml/2006/main" xmlns:w14="http://schemas.microsoft.com/office/word/2010/wordml" xmlns:w15="http://schemas.microsoft.com/office/word/2012/wordml" xmlns:w16se="http://schemas.microsoft.com/office/word/2015/wordml/symex">
+  <w:p>
+    <w:pPr>
+      <w:pBdr>
+        <w:bottom w:val="single" w:color="E2E8F0" w:sz="1"/>
+      </w:pBdr>
+      <w:tabs>
+        <w:tab w:val="right" w:pos="9880"/>
+      </w:tabs>
+      <w:spacing w:after="80" w:before="80"/>
+    </w:pPr>
+    <w:r>
+      <w:drawing>
+        <wp:inline xmlns:wp="http://schemas.openxmlformats.org/drawingml/2006/wordprocessingDrawing" distT="0" distB="0" distL="0" distR="0">
+          <wp:extent cx="209550" cy="238125"/>
+          <wp:effectExtent l="0" t="0" r="0" b="0"/>
+          <wp:docPr id="1" name="header-favicon"/>
+          <wp:cNvGraphicFramePr>
+            <a:graphicFrameLocks xmlns:a="http://schemas.openxmlformats.org/drawingml/2006/main" noChangeAspect="1"/>
+          </wp:cNvGraphicFramePr>
+          <a:graphic xmlns:a="http://schemas.openxmlformats.org/drawingml/2006/main">
+            <a:graphicData uri="http://schemas.openxmlformats.org/drawingml/2006/picture">
+              <pic:pic xmlns:pic="http://schemas.openxmlformats.org/drawingml/2006/picture">
+                <pic:nvPicPr>
+                  <pic:cNvPr id="1" name="header-favicon"/>
+                  <pic:cNvPicPr/>
+                </pic:nvPicPr>
+                <pic:blipFill>
+                  <a:blip r:embed="rId1"/>
+                  <a:stretch>
+                    <a:fillRect/>
+                  </a:stretch>
+                </pic:blipFill>
+                <pic:spPr>
+                  <a:xfrm>
+                    <a:off x="0" y="0"/>
+                    <a:ext cx="209550" cy="238125"/>
+                  </a:xfrm>
+                  <a:prstGeom prst="rect">
+                    <a:avLst/>
+                  </a:prstGeom>
+                </pic:spPr>
+              </pic:pic>
+            </a:graphicData>
+          </a:graphic>
+        </wp:inline>
+      </w:drawing>
+    </w:r>
+    <w:r>
+      <w:rPr>
+        <w:rFonts w:ascii="Arial" w:cs="Arial" w:eastAsia="Arial" w:hAnsi="Arial"/>
+        <w:sz w:val="18"/>
+      </w:rPr>
+      <w:t xml:space="preserve">  </w:t>
+    </w:r>
+    <w:r>
+      <w:rPr>
+        <w:rFonts w:ascii="Arial" w:cs="Arial" w:eastAsia="Arial" w:hAnsi="Arial"/>
+        <w:b/>
+        <w:bCs/>
+        <w:color w:val="D97706"/>
+        <w:sz w:val="24"/>
+        <w:szCs w:val="24"/>
+      </w:rPr>
+      <w:t xml:space="preserve">PREQAL</w:t>
+    </w:r>
+    <w:r>
+      <w:rPr>
+        <w:rFonts w:ascii="Arial" w:cs="Arial" w:eastAsia="Arial" w:hAnsi="Arial"/>
+        <w:color w:val="475569"/>
+        <w:sz w:val="22"/>
+        <w:szCs w:val="22"/>
+      </w:rPr>
+      <w:t xml:space="preserve">  ·  </w:t>
+    </w:r>
+    <w:r>
+      <w:rPr>
+        <w:rFonts w:ascii="Arial" w:cs="Arial" w:eastAsia="Arial" w:hAnsi="Arial"/>
+        <w:color w:val="64748B"/>
+        <w:sz w:val="20"/>
+        <w:szCs w:val="20"/>
+      </w:rPr>
+      <w:t xml:space="preserve">— Quality Policy</w:t>
+    </w:r>
+    <w:r>
+      <w:rPr>
+        <w:rFonts w:ascii="Arial" w:cs="Arial" w:eastAsia="Arial" w:hAnsi="Arial"/>
+        <w:sz w:val="18"/>
+      </w:rPr>
+      <w:t xml:space="preserve">	</w:t>
+    </w:r>
+    <w:r>
+      <w:rPr>
+        <w:rFonts w:ascii="Arial" w:cs="Arial" w:eastAsia="Arial" w:hAnsi="Arial"/>
+        <w:i/>
+        <w:iCs/>
+        <w:color w:val="94A3B8"/>
+        <w:sz w:val="16"/>
+        <w:szCs w:val="16"/>
+      </w:rPr>
+      <w:t xml:space="preserve">Confidential — Internal Use Only</w:t>
+    </w:r>
+  </w:p>
+</w:hdr>
 </file>
 
 <file path=word/numbering.xml><?xml version="1.0" encoding="utf-8"?>

</xml_diff>